<commit_message>
Final doc update before printing + Game objects work.
</commit_message>
<xml_diff>
--- a/Docs.docx
+++ b/Docs.docx
@@ -3068,14 +3068,14 @@
             <v:path o:extrusionok="f" gradientshapeok="t" o:connecttype="rect"/>
             <o:lock v:ext="edit" aspectratio="t"/>
           </v:shapetype>
-          <v:shape id="_x0000_i1025" type="#_x0000_t75" style="width:403.9pt;height:163.85pt" o:ole="" o:bordertopcolor="this" o:borderleftcolor="this" o:borderbottomcolor="this" o:borderrightcolor="this">
+          <v:shape id="_x0000_i1025" type="#_x0000_t75" style="width:404.25pt;height:163.5pt" o:ole="" o:bordertopcolor="this" o:borderleftcolor="this" o:borderbottomcolor="this" o:borderrightcolor="this">
             <v:imagedata r:id="rId14" o:title=""/>
             <w10:bordertop type="single" width="4"/>
             <w10:borderleft type="single" width="4"/>
             <w10:borderbottom type="single" width="4"/>
             <w10:borderright type="single" width="4"/>
           </v:shape>
-          <o:OLEObject Type="Embed" ProgID="Word.OpenDocumentText.12" ShapeID="_x0000_i1025" DrawAspect="Content" ObjectID="_1838997730" r:id="rId15"/>
+          <o:OLEObject Type="Embed" ProgID="Word.OpenDocumentText.12" ShapeID="_x0000_i1025" DrawAspect="Content" ObjectID="_1839324471" r:id="rId15"/>
         </w:object>
       </w:r>
     </w:p>
@@ -3114,14 +3114,14 @@
           <w:lang w:val="en-US"/>
         </w:rPr>
         <w:object w:dxaOrig="9026" w:dyaOrig="562" w14:anchorId="099D0BF2">
-          <v:shape id="_x0000_i1026" type="#_x0000_t75" style="width:451.3pt;height:28.1pt" o:ole="" o:bordertopcolor="this" o:borderleftcolor="this" o:borderbottomcolor="this" o:borderrightcolor="this">
+          <v:shape id="_x0000_i1026" type="#_x0000_t75" style="width:451.5pt;height:27.75pt" o:ole="" o:bordertopcolor="this" o:borderleftcolor="this" o:borderbottomcolor="this" o:borderrightcolor="this">
             <v:imagedata r:id="rId16" o:title=""/>
             <w10:bordertop type="single" width="4"/>
             <w10:borderleft type="single" width="4"/>
             <w10:borderbottom type="single" width="4"/>
             <w10:borderright type="single" width="4"/>
           </v:shape>
-          <o:OLEObject Type="Embed" ProgID="Word.OpenDocumentText.12" ShapeID="_x0000_i1026" DrawAspect="Content" ObjectID="_1838997731" r:id="rId17"/>
+          <o:OLEObject Type="Embed" ProgID="Word.OpenDocumentText.12" ShapeID="_x0000_i1026" DrawAspect="Content" ObjectID="_1839324472" r:id="rId17"/>
         </w:object>
       </w:r>
     </w:p>
@@ -3299,14 +3299,14 @@
           <w:lang w:val="en-US"/>
         </w:rPr>
         <w:object w:dxaOrig="9026" w:dyaOrig="843" w14:anchorId="3803F6A7">
-          <v:shape id="_x0000_i1027" type="#_x0000_t75" style="width:451.3pt;height:42.15pt" o:ole="" o:bordertopcolor="this" o:borderleftcolor="this" o:borderbottomcolor="this" o:borderrightcolor="this">
+          <v:shape id="_x0000_i1027" type="#_x0000_t75" style="width:451.5pt;height:42pt" o:ole="" o:bordertopcolor="this" o:borderleftcolor="this" o:borderbottomcolor="this" o:borderrightcolor="this">
             <v:imagedata r:id="rId18" o:title=""/>
             <w10:bordertop type="single" width="4"/>
             <w10:borderleft type="single" width="4"/>
             <w10:borderbottom type="single" width="4"/>
             <w10:borderright type="single" width="4"/>
           </v:shape>
-          <o:OLEObject Type="Embed" ProgID="Word.OpenDocumentText.12" ShapeID="_x0000_i1027" DrawAspect="Content" ObjectID="_1838997732" r:id="rId19"/>
+          <o:OLEObject Type="Embed" ProgID="Word.OpenDocumentText.12" ShapeID="_x0000_i1027" DrawAspect="Content" ObjectID="_1839324473" r:id="rId19"/>
         </w:object>
       </w:r>
     </w:p>
@@ -3354,14 +3354,14 @@
           <w:lang w:val="en-US"/>
         </w:rPr>
         <w:object w:dxaOrig="9026" w:dyaOrig="843" w14:anchorId="3C311A47">
-          <v:shape id="_x0000_i1028" type="#_x0000_t75" style="width:451.3pt;height:42.15pt" o:ole="" o:bordertopcolor="this" o:borderleftcolor="this" o:borderbottomcolor="this" o:borderrightcolor="this">
+          <v:shape id="_x0000_i1028" type="#_x0000_t75" style="width:451.5pt;height:42pt" o:ole="" o:bordertopcolor="this" o:borderleftcolor="this" o:borderbottomcolor="this" o:borderrightcolor="this">
             <v:imagedata r:id="rId20" o:title=""/>
             <w10:bordertop type="single" width="4"/>
             <w10:borderleft type="single" width="4"/>
             <w10:borderbottom type="single" width="4"/>
             <w10:borderright type="single" width="4"/>
           </v:shape>
-          <o:OLEObject Type="Embed" ProgID="Word.OpenDocumentText.12" ShapeID="_x0000_i1028" DrawAspect="Content" ObjectID="_1838997733" r:id="rId21"/>
+          <o:OLEObject Type="Embed" ProgID="Word.OpenDocumentText.12" ShapeID="_x0000_i1028" DrawAspect="Content" ObjectID="_1839324474" r:id="rId21"/>
         </w:object>
       </w:r>
     </w:p>
@@ -3405,14 +3405,14 @@
           <w:lang w:val="en-US"/>
         </w:rPr>
         <w:object w:dxaOrig="9026" w:dyaOrig="843" w14:anchorId="0DF40D06">
-          <v:shape id="_x0000_i1029" type="#_x0000_t75" style="width:451.3pt;height:42.15pt" o:ole="" o:bordertopcolor="this" o:borderleftcolor="this" o:borderbottomcolor="this" o:borderrightcolor="this">
+          <v:shape id="_x0000_i1029" type="#_x0000_t75" style="width:451.5pt;height:42pt" o:ole="" o:bordertopcolor="this" o:borderleftcolor="this" o:borderbottomcolor="this" o:borderrightcolor="this">
             <v:imagedata r:id="rId22" o:title=""/>
             <w10:bordertop type="single" width="4"/>
             <w10:borderleft type="single" width="4"/>
             <w10:borderbottom type="single" width="4"/>
             <w10:borderright type="single" width="4"/>
           </v:shape>
-          <o:OLEObject Type="Embed" ProgID="Word.OpenDocumentText.12" ShapeID="_x0000_i1029" DrawAspect="Content" ObjectID="_1838997734" r:id="rId23"/>
+          <o:OLEObject Type="Embed" ProgID="Word.OpenDocumentText.12" ShapeID="_x0000_i1029" DrawAspect="Content" ObjectID="_1839324475" r:id="rId23"/>
         </w:object>
       </w:r>
       <w:bookmarkStart w:id="12" w:name="_II._Structura"/>
@@ -3986,14 +3986,14 @@
           <w:lang w:val="en-US"/>
         </w:rPr>
         <w:object w:dxaOrig="9026" w:dyaOrig="1686" w14:anchorId="5AA9B6B3">
-          <v:shape id="_x0000_i1030" type="#_x0000_t75" style="width:451.3pt;height:84.3pt" o:ole="" o:bordertopcolor="this" o:borderleftcolor="this" o:borderbottomcolor="this" o:borderrightcolor="this">
+          <v:shape id="_x0000_i1030" type="#_x0000_t75" style="width:451.5pt;height:84pt" o:ole="" o:bordertopcolor="this" o:borderleftcolor="this" o:borderbottomcolor="this" o:borderrightcolor="this">
             <v:imagedata r:id="rId29" o:title=""/>
             <w10:bordertop type="single" width="4"/>
             <w10:borderleft type="single" width="4"/>
             <w10:borderbottom type="single" width="4"/>
             <w10:borderright type="single" width="4"/>
           </v:shape>
-          <o:OLEObject Type="Embed" ProgID="Word.OpenDocumentText.12" ShapeID="_x0000_i1030" DrawAspect="Content" ObjectID="_1838997735" r:id="rId30"/>
+          <o:OLEObject Type="Embed" ProgID="Word.OpenDocumentText.12" ShapeID="_x0000_i1030" DrawAspect="Content" ObjectID="_1839324476" r:id="rId30"/>
         </w:object>
       </w:r>
     </w:p>
@@ -4091,14 +4091,14 @@
           <w:lang w:val="en-US"/>
         </w:rPr>
         <w:object w:dxaOrig="9026" w:dyaOrig="562" w14:anchorId="2B6276FB">
-          <v:shape id="_x0000_i1031" type="#_x0000_t75" style="width:451.3pt;height:28.1pt" o:ole="" o:bordertopcolor="this" o:borderleftcolor="this" o:borderbottomcolor="this" o:borderrightcolor="this">
+          <v:shape id="_x0000_i1031" type="#_x0000_t75" style="width:451.5pt;height:27.75pt" o:ole="" o:bordertopcolor="this" o:borderleftcolor="this" o:borderbottomcolor="this" o:borderrightcolor="this">
             <v:imagedata r:id="rId31" o:title=""/>
             <w10:bordertop type="single" width="4"/>
             <w10:borderleft type="single" width="4"/>
             <w10:borderbottom type="single" width="4"/>
             <w10:borderright type="single" width="4"/>
           </v:shape>
-          <o:OLEObject Type="Embed" ProgID="Word.OpenDocumentText.12" ShapeID="_x0000_i1031" DrawAspect="Content" ObjectID="_1838997736" r:id="rId32"/>
+          <o:OLEObject Type="Embed" ProgID="Word.OpenDocumentText.12" ShapeID="_x0000_i1031" DrawAspect="Content" ObjectID="_1839324477" r:id="rId32"/>
         </w:object>
       </w:r>
     </w:p>
@@ -4159,14 +4159,14 @@
           <w:lang w:val="en-US"/>
         </w:rPr>
         <w:object w:dxaOrig="9026" w:dyaOrig="562" w14:anchorId="1DA88245">
-          <v:shape id="_x0000_i1032" type="#_x0000_t75" style="width:451.3pt;height:28.1pt" o:ole="" o:bordertopcolor="this" o:borderleftcolor="this" o:borderbottomcolor="this" o:borderrightcolor="this">
+          <v:shape id="_x0000_i1032" type="#_x0000_t75" style="width:451.5pt;height:27.75pt" o:ole="" o:bordertopcolor="this" o:borderleftcolor="this" o:borderbottomcolor="this" o:borderrightcolor="this">
             <v:imagedata r:id="rId33" o:title=""/>
             <w10:bordertop type="single" width="4"/>
             <w10:borderleft type="single" width="4"/>
             <w10:borderbottom type="single" width="4"/>
             <w10:borderright type="single" width="4"/>
           </v:shape>
-          <o:OLEObject Type="Embed" ProgID="Word.OpenDocumentText.12" ShapeID="_x0000_i1032" DrawAspect="Content" ObjectID="_1838997737" r:id="rId34"/>
+          <o:OLEObject Type="Embed" ProgID="Word.OpenDocumentText.12" ShapeID="_x0000_i1032" DrawAspect="Content" ObjectID="_1839324478" r:id="rId34"/>
         </w:object>
       </w:r>
     </w:p>
@@ -4241,14 +4241,14 @@
           <w:lang w:val="en-US"/>
         </w:rPr>
         <w:object w:dxaOrig="9026" w:dyaOrig="562" w14:anchorId="5FC8E17F">
-          <v:shape id="_x0000_i1033" type="#_x0000_t75" style="width:451.3pt;height:28.1pt" o:ole="" o:bordertopcolor="this" o:borderleftcolor="this" o:borderbottomcolor="this" o:borderrightcolor="this">
+          <v:shape id="_x0000_i1033" type="#_x0000_t75" style="width:451.5pt;height:27.75pt" o:ole="" o:bordertopcolor="this" o:borderleftcolor="this" o:borderbottomcolor="this" o:borderrightcolor="this">
             <v:imagedata r:id="rId35" o:title=""/>
             <w10:bordertop type="single" width="4"/>
             <w10:borderleft type="single" width="4"/>
             <w10:borderbottom type="single" width="4"/>
             <w10:borderright type="single" width="4"/>
           </v:shape>
-          <o:OLEObject Type="Embed" ProgID="Word.OpenDocumentText.12" ShapeID="_x0000_i1033" DrawAspect="Content" ObjectID="_1838997738" r:id="rId36"/>
+          <o:OLEObject Type="Embed" ProgID="Word.OpenDocumentText.12" ShapeID="_x0000_i1033" DrawAspect="Content" ObjectID="_1839324479" r:id="rId36"/>
         </w:object>
       </w:r>
     </w:p>
@@ -4382,14 +4382,14 @@
           <w:lang w:val="en-US"/>
         </w:rPr>
         <w:object w:dxaOrig="9026" w:dyaOrig="1686" w14:anchorId="51B97F7C">
-          <v:shape id="_x0000_i1034" type="#_x0000_t75" style="width:451.3pt;height:84.3pt" o:ole="" o:bordertopcolor="this" o:borderleftcolor="this" o:borderbottomcolor="this" o:borderrightcolor="this">
+          <v:shape id="_x0000_i1034" type="#_x0000_t75" style="width:451.5pt;height:84pt" o:ole="" o:bordertopcolor="this" o:borderleftcolor="this" o:borderbottomcolor="this" o:borderrightcolor="this">
             <v:imagedata r:id="rId37" o:title=""/>
             <w10:bordertop type="single" width="4"/>
             <w10:borderleft type="single" width="4"/>
             <w10:borderbottom type="single" width="4"/>
             <w10:borderright type="single" width="4"/>
           </v:shape>
-          <o:OLEObject Type="Embed" ProgID="Word.OpenDocumentText.12" ShapeID="_x0000_i1034" DrawAspect="Content" ObjectID="_1838997739" r:id="rId38"/>
+          <o:OLEObject Type="Embed" ProgID="Word.OpenDocumentText.12" ShapeID="_x0000_i1034" DrawAspect="Content" ObjectID="_1839324480" r:id="rId38"/>
         </w:object>
       </w:r>
     </w:p>
@@ -5290,14 +5290,14 @@
           <w:lang w:val="en-US"/>
         </w:rPr>
         <w:object w:dxaOrig="9026" w:dyaOrig="6323" w14:anchorId="6957392A">
-          <v:shape id="_x0000_i1035" type="#_x0000_t75" style="width:451.3pt;height:316.15pt" o:ole="" o:bordertopcolor="this" o:borderleftcolor="this" o:borderbottomcolor="this" o:borderrightcolor="this">
+          <v:shape id="_x0000_i1035" type="#_x0000_t75" style="width:451.5pt;height:316.5pt" o:ole="" o:bordertopcolor="this" o:borderleftcolor="this" o:borderbottomcolor="this" o:borderrightcolor="this">
             <v:imagedata r:id="rId39" o:title=""/>
             <w10:bordertop type="single" width="4"/>
             <w10:borderleft type="single" width="4"/>
             <w10:borderbottom type="single" width="4"/>
             <w10:borderright type="single" width="4"/>
           </v:shape>
-          <o:OLEObject Type="Embed" ProgID="Word.OpenDocumentText.12" ShapeID="_x0000_i1035" DrawAspect="Content" ObjectID="_1838997740" r:id="rId40"/>
+          <o:OLEObject Type="Embed" ProgID="Word.OpenDocumentText.12" ShapeID="_x0000_i1035" DrawAspect="Content" ObjectID="_1839324481" r:id="rId40"/>
         </w:object>
       </w:r>
     </w:p>
@@ -5333,14 +5333,14 @@
           <w:lang w:val="en-US"/>
         </w:rPr>
         <w:object w:dxaOrig="9026" w:dyaOrig="2529" w14:anchorId="4C5F2198">
-          <v:shape id="_x0000_i1036" type="#_x0000_t75" style="width:451.3pt;height:126.45pt" o:ole="" o:bordertopcolor="this" o:borderleftcolor="this" o:borderbottomcolor="this" o:borderrightcolor="this">
+          <v:shape id="_x0000_i1036" type="#_x0000_t75" style="width:451.5pt;height:126.75pt" o:ole="" o:bordertopcolor="this" o:borderleftcolor="this" o:borderbottomcolor="this" o:borderrightcolor="this">
             <v:imagedata r:id="rId41" o:title=""/>
             <w10:bordertop type="single" width="4"/>
             <w10:borderleft type="single" width="4"/>
             <w10:borderbottom type="single" width="4"/>
             <w10:borderright type="single" width="4"/>
           </v:shape>
-          <o:OLEObject Type="Embed" ProgID="Word.OpenDocumentText.12" ShapeID="_x0000_i1036" DrawAspect="Content" ObjectID="_1838997741" r:id="rId42"/>
+          <o:OLEObject Type="Embed" ProgID="Word.OpenDocumentText.12" ShapeID="_x0000_i1036" DrawAspect="Content" ObjectID="_1839324482" r:id="rId42"/>
         </w:object>
       </w:r>
     </w:p>
@@ -5376,14 +5376,14 @@
           <w:lang w:val="en-US"/>
         </w:rPr>
         <w:object w:dxaOrig="9026" w:dyaOrig="1686" w14:anchorId="7147624A">
-          <v:shape id="_x0000_i1037" type="#_x0000_t75" style="width:451.3pt;height:84.3pt" o:ole="" o:bordertopcolor="this" o:borderleftcolor="this" o:borderbottomcolor="this" o:borderrightcolor="this">
+          <v:shape id="_x0000_i1037" type="#_x0000_t75" style="width:451.5pt;height:84pt" o:ole="" o:bordertopcolor="this" o:borderleftcolor="this" o:borderbottomcolor="this" o:borderrightcolor="this">
             <v:imagedata r:id="rId43" o:title=""/>
             <w10:bordertop type="single" width="4"/>
             <w10:borderleft type="single" width="4"/>
             <w10:borderbottom type="single" width="4"/>
             <w10:borderright type="single" width="4"/>
           </v:shape>
-          <o:OLEObject Type="Embed" ProgID="Word.OpenDocumentText.12" ShapeID="_x0000_i1037" DrawAspect="Content" ObjectID="_1838997742" r:id="rId44"/>
+          <o:OLEObject Type="Embed" ProgID="Word.OpenDocumentText.12" ShapeID="_x0000_i1037" DrawAspect="Content" ObjectID="_1839324483" r:id="rId44"/>
         </w:object>
       </w:r>
     </w:p>
@@ -5547,14 +5547,14 @@
           <w:lang w:val="en-US"/>
         </w:rPr>
         <w:object w:dxaOrig="9026" w:dyaOrig="1405" w14:anchorId="2193020A">
-          <v:shape id="_x0000_i1038" type="#_x0000_t75" style="width:451.3pt;height:70.25pt" o:ole="" o:bordertopcolor="this" o:borderleftcolor="this" o:borderbottomcolor="this" o:borderrightcolor="this">
+          <v:shape id="_x0000_i1038" type="#_x0000_t75" style="width:451.5pt;height:70.5pt" o:ole="" o:bordertopcolor="this" o:borderleftcolor="this" o:borderbottomcolor="this" o:borderrightcolor="this">
             <v:imagedata r:id="rId45" o:title=""/>
             <w10:bordertop type="single" width="4"/>
             <w10:borderleft type="single" width="4"/>
             <w10:borderbottom type="single" width="4"/>
             <w10:borderright type="single" width="4"/>
           </v:shape>
-          <o:OLEObject Type="Embed" ProgID="Word.OpenDocumentText.12" ShapeID="_x0000_i1038" DrawAspect="Content" ObjectID="_1838997743" r:id="rId46"/>
+          <o:OLEObject Type="Embed" ProgID="Word.OpenDocumentText.12" ShapeID="_x0000_i1038" DrawAspect="Content" ObjectID="_1839324484" r:id="rId46"/>
         </w:object>
       </w:r>
     </w:p>
@@ -5614,14 +5614,14 @@
           <w:lang w:val="en-US"/>
         </w:rPr>
         <w:object w:dxaOrig="9026" w:dyaOrig="1967" w14:anchorId="50087815">
-          <v:shape id="_x0000_i1039" type="#_x0000_t75" style="width:451.3pt;height:98.35pt" o:ole="" o:bordertopcolor="this" o:borderleftcolor="this" o:borderbottomcolor="this" o:borderrightcolor="this">
+          <v:shape id="_x0000_i1039" type="#_x0000_t75" style="width:451.5pt;height:98.25pt" o:ole="" o:bordertopcolor="this" o:borderleftcolor="this" o:borderbottomcolor="this" o:borderrightcolor="this">
             <v:imagedata r:id="rId47" o:title=""/>
             <w10:bordertop type="single" width="4"/>
             <w10:borderleft type="single" width="4"/>
             <w10:borderbottom type="single" width="4"/>
             <w10:borderright type="single" width="4"/>
           </v:shape>
-          <o:OLEObject Type="Embed" ProgID="Word.OpenDocumentText.12" ShapeID="_x0000_i1039" DrawAspect="Content" ObjectID="_1838997744" r:id="rId48"/>
+          <o:OLEObject Type="Embed" ProgID="Word.OpenDocumentText.12" ShapeID="_x0000_i1039" DrawAspect="Content" ObjectID="_1839324485" r:id="rId48"/>
         </w:object>
       </w:r>
     </w:p>
@@ -5665,14 +5665,14 @@
           <w:lang w:val="en-US"/>
         </w:rPr>
         <w:object w:dxaOrig="9026" w:dyaOrig="3934" w14:anchorId="6502F521">
-          <v:shape id="_x0000_i1073" type="#_x0000_t75" style="width:451.3pt;height:196.7pt" o:ole="">
+          <v:shape id="_x0000_i1040" type="#_x0000_t75" style="width:451.5pt;height:196.5pt" o:ole="" o:bordertopcolor="this" o:borderleftcolor="this" o:borderbottomcolor="this" o:borderrightcolor="this">
             <v:imagedata r:id="rId49" o:title=""/>
             <w10:bordertop type="single" width="4"/>
             <w10:borderleft type="single" width="4"/>
             <w10:borderbottom type="single" width="4"/>
             <w10:borderright type="single" width="4"/>
           </v:shape>
-          <o:OLEObject Type="Embed" ProgID="Word.OpenDocumentText.12" ShapeID="_x0000_i1073" DrawAspect="Content" ObjectID="_1838997745" r:id="rId50"/>
+          <o:OLEObject Type="Embed" ProgID="Word.OpenDocumentText.12" ShapeID="_x0000_i1040" DrawAspect="Content" ObjectID="_1839324486" r:id="rId50"/>
         </w:object>
       </w:r>
     </w:p>
@@ -5769,14 +5769,14 @@
           <w:lang w:val="en-US"/>
         </w:rPr>
         <w:object w:dxaOrig="9026" w:dyaOrig="1686" w14:anchorId="32856A70">
-          <v:shape id="_x0000_i1041" type="#_x0000_t75" style="width:451.3pt;height:84.3pt" o:ole="" o:bordertopcolor="this" o:borderleftcolor="this" o:borderbottomcolor="this" o:borderrightcolor="this">
+          <v:shape id="_x0000_i1041" type="#_x0000_t75" style="width:451.5pt;height:84pt" o:ole="" o:bordertopcolor="this" o:borderleftcolor="this" o:borderbottomcolor="this" o:borderrightcolor="this">
             <v:imagedata r:id="rId51" o:title=""/>
             <w10:bordertop type="single" width="4"/>
             <w10:borderleft type="single" width="4"/>
             <w10:borderbottom type="single" width="4"/>
             <w10:borderright type="single" width="4"/>
           </v:shape>
-          <o:OLEObject Type="Embed" ProgID="Word.OpenDocumentText.12" ShapeID="_x0000_i1041" DrawAspect="Content" ObjectID="_1838997746" r:id="rId52"/>
+          <o:OLEObject Type="Embed" ProgID="Word.OpenDocumentText.12" ShapeID="_x0000_i1041" DrawAspect="Content" ObjectID="_1839324487" r:id="rId52"/>
         </w:object>
       </w:r>
     </w:p>
@@ -5891,14 +5891,14 @@
           <w:lang w:val="en-US"/>
         </w:rPr>
         <w:object w:dxaOrig="9026" w:dyaOrig="3239" w14:anchorId="7C6C1D17">
-          <v:shape id="_x0000_i1042" type="#_x0000_t75" style="width:451.3pt;height:161.95pt" o:ole="" o:bordertopcolor="this" o:borderleftcolor="this" o:borderbottomcolor="this" o:borderrightcolor="this">
+          <v:shape id="_x0000_i1042" type="#_x0000_t75" style="width:451.5pt;height:162pt" o:ole="" o:bordertopcolor="this" o:borderleftcolor="this" o:borderbottomcolor="this" o:borderrightcolor="this">
             <v:imagedata r:id="rId53" o:title=""/>
             <w10:bordertop type="single" width="4"/>
             <w10:borderleft type="single" width="4"/>
             <w10:borderbottom type="single" width="4"/>
             <w10:borderright type="single" width="4"/>
           </v:shape>
-          <o:OLEObject Type="Embed" ProgID="Word.OpenDocumentText.12" ShapeID="_x0000_i1042" DrawAspect="Content" ObjectID="_1838997747" r:id="rId54"/>
+          <o:OLEObject Type="Embed" ProgID="Word.OpenDocumentText.12" ShapeID="_x0000_i1042" DrawAspect="Content" ObjectID="_1839324488" r:id="rId54"/>
         </w:object>
       </w:r>
     </w:p>
@@ -5964,14 +5964,14 @@
           <w:lang w:val="en-US"/>
         </w:rPr>
         <w:object w:dxaOrig="9026" w:dyaOrig="562" w14:anchorId="3EB73B57">
-          <v:shape id="_x0000_i1043" type="#_x0000_t75" style="width:451.3pt;height:28.1pt" o:ole="" o:bordertopcolor="this" o:borderleftcolor="this" o:borderbottomcolor="this" o:borderrightcolor="this">
+          <v:shape id="_x0000_i1043" type="#_x0000_t75" style="width:451.5pt;height:27.75pt" o:ole="" o:bordertopcolor="this" o:borderleftcolor="this" o:borderbottomcolor="this" o:borderrightcolor="this">
             <v:imagedata r:id="rId55" o:title=""/>
             <w10:bordertop type="single" width="4"/>
             <w10:borderleft type="single" width="4"/>
             <w10:borderbottom type="single" width="4"/>
             <w10:borderright type="single" width="4"/>
           </v:shape>
-          <o:OLEObject Type="Embed" ProgID="Word.OpenDocumentText.12" ShapeID="_x0000_i1043" DrawAspect="Content" ObjectID="_1838997748" r:id="rId56"/>
+          <o:OLEObject Type="Embed" ProgID="Word.OpenDocumentText.12" ShapeID="_x0000_i1043" DrawAspect="Content" ObjectID="_1839324489" r:id="rId56"/>
         </w:object>
       </w:r>
     </w:p>
@@ -6047,14 +6047,14 @@
           <w:lang w:val="en-US"/>
         </w:rPr>
         <w:object w:dxaOrig="9026" w:dyaOrig="2543" w14:anchorId="52BBFB16">
-          <v:shape id="_x0000_i1044" type="#_x0000_t75" style="width:451.3pt;height:127.15pt" o:ole="" o:bordertopcolor="this" o:borderleftcolor="this" o:borderbottomcolor="this" o:borderrightcolor="this">
+          <v:shape id="_x0000_i1044" type="#_x0000_t75" style="width:451.5pt;height:127.5pt" o:ole="" o:bordertopcolor="this" o:borderleftcolor="this" o:borderbottomcolor="this" o:borderrightcolor="this">
             <v:imagedata r:id="rId57" o:title=""/>
             <w10:bordertop type="single" width="4"/>
             <w10:borderleft type="single" width="4"/>
             <w10:borderbottom type="single" width="4"/>
             <w10:borderright type="single" width="4"/>
           </v:shape>
-          <o:OLEObject Type="Embed" ProgID="Word.OpenDocumentText.12" ShapeID="_x0000_i1044" DrawAspect="Content" ObjectID="_1838997749" r:id="rId58"/>
+          <o:OLEObject Type="Embed" ProgID="Word.OpenDocumentText.12" ShapeID="_x0000_i1044" DrawAspect="Content" ObjectID="_1839324490" r:id="rId58"/>
         </w:object>
       </w:r>
     </w:p>
@@ -6177,14 +6177,14 @@
           <w:lang w:val="en-US"/>
         </w:rPr>
         <w:object w:dxaOrig="9026" w:dyaOrig="3091" w14:anchorId="678539CD">
-          <v:shape id="_x0000_i1045" type="#_x0000_t75" style="width:451.3pt;height:154.55pt" o:ole="" o:bordertopcolor="this" o:borderleftcolor="this" o:borderbottomcolor="this" o:borderrightcolor="this">
+          <v:shape id="_x0000_i1045" type="#_x0000_t75" style="width:451.5pt;height:154.5pt" o:ole="" o:bordertopcolor="this" o:borderleftcolor="this" o:borderbottomcolor="this" o:borderrightcolor="this">
             <v:imagedata r:id="rId59" o:title=""/>
             <w10:bordertop type="single" width="4"/>
             <w10:borderleft type="single" width="4"/>
             <w10:borderbottom type="single" width="4"/>
             <w10:borderright type="single" width="4"/>
           </v:shape>
-          <o:OLEObject Type="Embed" ProgID="Word.OpenDocumentText.12" ShapeID="_x0000_i1045" DrawAspect="Content" ObjectID="_1838997750" r:id="rId60"/>
+          <o:OLEObject Type="Embed" ProgID="Word.OpenDocumentText.12" ShapeID="_x0000_i1045" DrawAspect="Content" ObjectID="_1839324491" r:id="rId60"/>
         </w:object>
       </w:r>
     </w:p>
@@ -6279,14 +6279,14 @@
           <w:lang w:val="en-US"/>
         </w:rPr>
         <w:object w:dxaOrig="9026" w:dyaOrig="843" w14:anchorId="73E55CA8">
-          <v:shape id="_x0000_i1046" type="#_x0000_t75" style="width:451.3pt;height:42.15pt" o:ole="" o:bordertopcolor="this" o:borderleftcolor="this" o:borderbottomcolor="this" o:borderrightcolor="this">
+          <v:shape id="_x0000_i1046" type="#_x0000_t75" style="width:451.5pt;height:42pt" o:ole="" o:bordertopcolor="this" o:borderleftcolor="this" o:borderbottomcolor="this" o:borderrightcolor="this">
             <v:imagedata r:id="rId61" o:title=""/>
             <w10:bordertop type="single" width="4"/>
             <w10:borderleft type="single" width="4"/>
             <w10:borderbottom type="single" width="4"/>
             <w10:borderright type="single" width="4"/>
           </v:shape>
-          <o:OLEObject Type="Embed" ProgID="Word.OpenDocumentText.12" ShapeID="_x0000_i1046" DrawAspect="Content" ObjectID="_1838997751" r:id="rId62"/>
+          <o:OLEObject Type="Embed" ProgID="Word.OpenDocumentText.12" ShapeID="_x0000_i1046" DrawAspect="Content" ObjectID="_1839324492" r:id="rId62"/>
         </w:object>
       </w:r>
     </w:p>
@@ -6336,14 +6336,14 @@
           <w:lang w:val="en-US"/>
         </w:rPr>
         <w:object w:dxaOrig="9026" w:dyaOrig="2529" w14:anchorId="5A57E5A3">
-          <v:shape id="_x0000_i1047" type="#_x0000_t75" style="width:451.3pt;height:126.45pt" o:ole="" o:bordertopcolor="this" o:borderleftcolor="this" o:borderbottomcolor="this" o:borderrightcolor="this">
+          <v:shape id="_x0000_i1047" type="#_x0000_t75" style="width:451.5pt;height:126.75pt" o:ole="" o:bordertopcolor="this" o:borderleftcolor="this" o:borderbottomcolor="this" o:borderrightcolor="this">
             <v:imagedata r:id="rId63" o:title=""/>
             <w10:bordertop type="single" width="4"/>
             <w10:borderleft type="single" width="4"/>
             <w10:borderbottom type="single" width="4"/>
             <w10:borderright type="single" width="4"/>
           </v:shape>
-          <o:OLEObject Type="Embed" ProgID="Word.OpenDocumentText.12" ShapeID="_x0000_i1047" DrawAspect="Content" ObjectID="_1838997752" r:id="rId64"/>
+          <o:OLEObject Type="Embed" ProgID="Word.OpenDocumentText.12" ShapeID="_x0000_i1047" DrawAspect="Content" ObjectID="_1839324493" r:id="rId64"/>
         </w:object>
       </w:r>
     </w:p>
@@ -6401,14 +6401,14 @@
           <w:lang w:val="en-US"/>
         </w:rPr>
         <w:object w:dxaOrig="9026" w:dyaOrig="3349" w14:anchorId="2CF35EDE">
-          <v:shape id="_x0000_i1048" type="#_x0000_t75" style="width:451.3pt;height:167.45pt" o:ole="" o:bordertopcolor="this" o:borderleftcolor="this" o:borderbottomcolor="this" o:borderrightcolor="this">
+          <v:shape id="_x0000_i1048" type="#_x0000_t75" style="width:451.5pt;height:167.25pt" o:ole="" o:bordertopcolor="this" o:borderleftcolor="this" o:borderbottomcolor="this" o:borderrightcolor="this">
             <v:imagedata r:id="rId65" o:title=""/>
             <w10:bordertop type="single" width="4"/>
             <w10:borderleft type="single" width="4"/>
             <w10:borderbottom type="single" width="4"/>
             <w10:borderright type="single" width="4"/>
           </v:shape>
-          <o:OLEObject Type="Embed" ProgID="Word.OpenDocumentText.12" ShapeID="_x0000_i1048" DrawAspect="Content" ObjectID="_1838997753" r:id="rId66"/>
+          <o:OLEObject Type="Embed" ProgID="Word.OpenDocumentText.12" ShapeID="_x0000_i1048" DrawAspect="Content" ObjectID="_1839324494" r:id="rId66"/>
         </w:object>
       </w:r>
     </w:p>
@@ -6542,14 +6542,14 @@
           <w:lang w:val="en-US"/>
         </w:rPr>
         <w:object w:dxaOrig="9026" w:dyaOrig="1686" w14:anchorId="59B79654">
-          <v:shape id="_x0000_i1049" type="#_x0000_t75" style="width:451.3pt;height:84.3pt" o:ole="" o:bordertopcolor="this" o:borderleftcolor="this" o:borderbottomcolor="this" o:borderrightcolor="this">
+          <v:shape id="_x0000_i1049" type="#_x0000_t75" style="width:451.5pt;height:84pt" o:ole="" o:bordertopcolor="this" o:borderleftcolor="this" o:borderbottomcolor="this" o:borderrightcolor="this">
             <v:imagedata r:id="rId67" o:title=""/>
             <w10:bordertop type="single" width="4"/>
             <w10:borderleft type="single" width="4"/>
             <w10:borderbottom type="single" width="4"/>
             <w10:borderright type="single" width="4"/>
           </v:shape>
-          <o:OLEObject Type="Embed" ProgID="Word.OpenDocumentText.12" ShapeID="_x0000_i1049" DrawAspect="Content" ObjectID="_1838997754" r:id="rId68"/>
+          <o:OLEObject Type="Embed" ProgID="Word.OpenDocumentText.12" ShapeID="_x0000_i1049" DrawAspect="Content" ObjectID="_1839324495" r:id="rId68"/>
         </w:object>
       </w:r>
     </w:p>
@@ -6601,14 +6601,14 @@
           <w:lang w:val="en-US"/>
         </w:rPr>
         <w:object w:dxaOrig="9026" w:dyaOrig="3372" w14:anchorId="1B584836">
-          <v:shape id="_x0000_i1050" type="#_x0000_t75" style="width:451.3pt;height:168.6pt" o:ole="" o:bordertopcolor="this" o:borderleftcolor="this" o:borderbottomcolor="this" o:borderrightcolor="this">
+          <v:shape id="_x0000_i1050" type="#_x0000_t75" style="width:451.5pt;height:168.75pt" o:ole="" o:bordertopcolor="this" o:borderleftcolor="this" o:borderbottomcolor="this" o:borderrightcolor="this">
             <v:imagedata r:id="rId69" o:title=""/>
             <w10:bordertop type="single" width="4"/>
             <w10:borderleft type="single" width="4"/>
             <w10:borderbottom type="single" width="4"/>
             <w10:borderright type="single" width="4"/>
           </v:shape>
-          <o:OLEObject Type="Embed" ProgID="Word.OpenDocumentText.12" ShapeID="_x0000_i1050" DrawAspect="Content" ObjectID="_1838997755" r:id="rId70"/>
+          <o:OLEObject Type="Embed" ProgID="Word.OpenDocumentText.12" ShapeID="_x0000_i1050" DrawAspect="Content" ObjectID="_1839324496" r:id="rId70"/>
         </w:object>
       </w:r>
     </w:p>
@@ -7269,14 +7269,14 @@
           <w:lang w:val="en-US"/>
         </w:rPr>
         <w:object w:dxaOrig="9026" w:dyaOrig="1686" w14:anchorId="3F2701AD">
-          <v:shape id="_x0000_i1051" type="#_x0000_t75" style="width:451.3pt;height:84.3pt" o:ole="" o:bordertopcolor="this" o:borderleftcolor="this" o:borderbottomcolor="this" o:borderrightcolor="this">
+          <v:shape id="_x0000_i1051" type="#_x0000_t75" style="width:451.5pt;height:84pt" o:ole="" o:bordertopcolor="this" o:borderleftcolor="this" o:borderbottomcolor="this" o:borderrightcolor="this">
             <v:imagedata r:id="rId71" o:title=""/>
             <w10:bordertop type="single" width="4"/>
             <w10:borderleft type="single" width="4"/>
             <w10:borderbottom type="single" width="4"/>
             <w10:borderright type="single" width="4"/>
           </v:shape>
-          <o:OLEObject Type="Embed" ProgID="Word.OpenDocumentText.12" ShapeID="_x0000_i1051" DrawAspect="Content" ObjectID="_1838997756" r:id="rId72"/>
+          <o:OLEObject Type="Embed" ProgID="Word.OpenDocumentText.12" ShapeID="_x0000_i1051" DrawAspect="Content" ObjectID="_1839324497" r:id="rId72"/>
         </w:object>
       </w:r>
     </w:p>
@@ -7374,14 +7374,14 @@
           <w:lang w:val="en-US"/>
         </w:rPr>
         <w:object w:dxaOrig="9026" w:dyaOrig="2810" w14:anchorId="111AF89C">
-          <v:shape id="_x0000_i1052" type="#_x0000_t75" style="width:451.3pt;height:140.5pt" o:ole="" o:bordertopcolor="this" o:borderleftcolor="this" o:borderbottomcolor="this" o:borderrightcolor="this">
+          <v:shape id="_x0000_i1052" type="#_x0000_t75" style="width:451.5pt;height:140.25pt" o:ole="" o:bordertopcolor="this" o:borderleftcolor="this" o:borderbottomcolor="this" o:borderrightcolor="this">
             <v:imagedata r:id="rId73" o:title=""/>
             <w10:bordertop type="single" width="4"/>
             <w10:borderleft type="single" width="4"/>
             <w10:borderbottom type="single" width="4"/>
             <w10:borderright type="single" width="4"/>
           </v:shape>
-          <o:OLEObject Type="Embed" ProgID="Word.OpenDocumentText.12" ShapeID="_x0000_i1052" DrawAspect="Content" ObjectID="_1838997757" r:id="rId74"/>
+          <o:OLEObject Type="Embed" ProgID="Word.OpenDocumentText.12" ShapeID="_x0000_i1052" DrawAspect="Content" ObjectID="_1839324498" r:id="rId74"/>
         </w:object>
       </w:r>
     </w:p>
@@ -7442,14 +7442,14 @@
           <w:lang w:val="en-US"/>
         </w:rPr>
         <w:object w:dxaOrig="9026" w:dyaOrig="3091" w14:anchorId="5E3DFAFA">
-          <v:shape id="_x0000_i1053" type="#_x0000_t75" style="width:451.3pt;height:154.55pt" o:ole="" o:bordertopcolor="this" o:borderleftcolor="this" o:borderbottomcolor="this" o:borderrightcolor="this">
+          <v:shape id="_x0000_i1053" type="#_x0000_t75" style="width:451.5pt;height:154.5pt" o:ole="" o:bordertopcolor="this" o:borderleftcolor="this" o:borderbottomcolor="this" o:borderrightcolor="this">
             <v:imagedata r:id="rId75" o:title=""/>
             <w10:bordertop type="single" width="4"/>
             <w10:borderleft type="single" width="4"/>
             <w10:borderbottom type="single" width="4"/>
             <w10:borderright type="single" width="4"/>
           </v:shape>
-          <o:OLEObject Type="Embed" ProgID="Word.OpenDocumentText.12" ShapeID="_x0000_i1053" DrawAspect="Content" ObjectID="_1838997758" r:id="rId76"/>
+          <o:OLEObject Type="Embed" ProgID="Word.OpenDocumentText.12" ShapeID="_x0000_i1053" DrawAspect="Content" ObjectID="_1839324499" r:id="rId76"/>
         </w:object>
       </w:r>
     </w:p>
@@ -7528,14 +7528,14 @@
           <w:lang w:val="en-US"/>
         </w:rPr>
         <w:object w:dxaOrig="9026" w:dyaOrig="281" w14:anchorId="4D4105F1">
-          <v:shape id="_x0000_i1054" type="#_x0000_t75" style="width:451.3pt;height:13.85pt" o:ole="" o:bordertopcolor="this" o:borderleftcolor="this" o:borderbottomcolor="this" o:borderrightcolor="this">
+          <v:shape id="_x0000_i1054" type="#_x0000_t75" style="width:451.5pt;height:13.5pt" o:ole="" o:bordertopcolor="this" o:borderleftcolor="this" o:borderbottomcolor="this" o:borderrightcolor="this">
             <v:imagedata r:id="rId77" o:title=""/>
             <w10:bordertop type="single" width="4"/>
             <w10:borderleft type="single" width="4"/>
             <w10:borderbottom type="single" width="4"/>
             <w10:borderright type="single" width="4"/>
           </v:shape>
-          <o:OLEObject Type="Embed" ProgID="Word.OpenDocumentText.12" ShapeID="_x0000_i1054" DrawAspect="Content" ObjectID="_1838997759" r:id="rId78"/>
+          <o:OLEObject Type="Embed" ProgID="Word.OpenDocumentText.12" ShapeID="_x0000_i1054" DrawAspect="Content" ObjectID="_1839324500" r:id="rId78"/>
         </w:object>
       </w:r>
     </w:p>
@@ -7579,14 +7579,14 @@
           <w:lang w:val="en-US"/>
         </w:rPr>
         <w:object w:dxaOrig="9026" w:dyaOrig="3372" w14:anchorId="6D72269A">
-          <v:shape id="_x0000_i1055" type="#_x0000_t75" style="width:451.3pt;height:168.6pt" o:ole="" o:bordertopcolor="this" o:borderleftcolor="this" o:borderbottomcolor="this" o:borderrightcolor="this">
+          <v:shape id="_x0000_i1055" type="#_x0000_t75" style="width:451.5pt;height:168.75pt" o:ole="" o:bordertopcolor="this" o:borderleftcolor="this" o:borderbottomcolor="this" o:borderrightcolor="this">
             <v:imagedata r:id="rId79" o:title=""/>
             <w10:bordertop type="single" width="4"/>
             <w10:borderleft type="single" width="4"/>
             <w10:borderbottom type="single" width="4"/>
             <w10:borderright type="single" width="4"/>
           </v:shape>
-          <o:OLEObject Type="Embed" ProgID="Word.OpenDocumentText.12" ShapeID="_x0000_i1055" DrawAspect="Content" ObjectID="_1838997760" r:id="rId80"/>
+          <o:OLEObject Type="Embed" ProgID="Word.OpenDocumentText.12" ShapeID="_x0000_i1055" DrawAspect="Content" ObjectID="_1839324501" r:id="rId80"/>
         </w:object>
       </w:r>
     </w:p>
@@ -7630,14 +7630,14 @@
           <w:lang w:val="en-US"/>
         </w:rPr>
         <w:object w:dxaOrig="9026" w:dyaOrig="1967" w14:anchorId="7F61EC1B">
-          <v:shape id="_x0000_i1056" type="#_x0000_t75" style="width:451.3pt;height:98.35pt" o:ole="" o:bordertopcolor="this" o:borderleftcolor="this" o:borderbottomcolor="this" o:borderrightcolor="this">
+          <v:shape id="_x0000_i1056" type="#_x0000_t75" style="width:451.5pt;height:98.25pt" o:ole="" o:bordertopcolor="this" o:borderleftcolor="this" o:borderbottomcolor="this" o:borderrightcolor="this">
             <v:imagedata r:id="rId81" o:title=""/>
             <w10:bordertop type="single" width="4"/>
             <w10:borderleft type="single" width="4"/>
             <w10:borderbottom type="single" width="4"/>
             <w10:borderright type="single" width="4"/>
           </v:shape>
-          <o:OLEObject Type="Embed" ProgID="Word.OpenDocumentText.12" ShapeID="_x0000_i1056" DrawAspect="Content" ObjectID="_1838997761" r:id="rId82"/>
+          <o:OLEObject Type="Embed" ProgID="Word.OpenDocumentText.12" ShapeID="_x0000_i1056" DrawAspect="Content" ObjectID="_1839324502" r:id="rId82"/>
         </w:object>
       </w:r>
     </w:p>
@@ -7736,14 +7736,14 @@
           <w:lang w:val="en-US"/>
         </w:rPr>
         <w:object w:dxaOrig="9026" w:dyaOrig="281" w14:anchorId="76D34F3D">
-          <v:shape id="_x0000_i1057" type="#_x0000_t75" style="width:451.3pt;height:13.85pt" o:ole="" o:bordertopcolor="this" o:borderleftcolor="this" o:borderbottomcolor="this" o:borderrightcolor="this">
+          <v:shape id="_x0000_i1057" type="#_x0000_t75" style="width:451.5pt;height:13.5pt" o:ole="" o:bordertopcolor="this" o:borderleftcolor="this" o:borderbottomcolor="this" o:borderrightcolor="this">
             <v:imagedata r:id="rId83" o:title=""/>
             <w10:bordertop type="single" width="4"/>
             <w10:borderleft type="single" width="4"/>
             <w10:borderbottom type="single" width="4"/>
             <w10:borderright type="single" width="4"/>
           </v:shape>
-          <o:OLEObject Type="Embed" ProgID="Word.OpenDocumentText.12" ShapeID="_x0000_i1057" DrawAspect="Content" ObjectID="_1838997762" r:id="rId84"/>
+          <o:OLEObject Type="Embed" ProgID="Word.OpenDocumentText.12" ShapeID="_x0000_i1057" DrawAspect="Content" ObjectID="_1839324503" r:id="rId84"/>
         </w:object>
       </w:r>
     </w:p>
@@ -7789,14 +7789,14 @@
           <w:lang w:val="en-US"/>
         </w:rPr>
         <w:object w:dxaOrig="9026" w:dyaOrig="2529" w14:anchorId="4612DE74">
-          <v:shape id="_x0000_i1058" type="#_x0000_t75" style="width:451.3pt;height:126.45pt" o:ole="" o:bordertopcolor="this" o:borderleftcolor="this" o:borderbottomcolor="this" o:borderrightcolor="this">
+          <v:shape id="_x0000_i1058" type="#_x0000_t75" style="width:451.5pt;height:126.75pt" o:ole="" o:bordertopcolor="this" o:borderleftcolor="this" o:borderbottomcolor="this" o:borderrightcolor="this">
             <v:imagedata r:id="rId85" o:title=""/>
             <w10:bordertop type="single" width="4"/>
             <w10:borderleft type="single" width="4"/>
             <w10:borderbottom type="single" width="4"/>
             <w10:borderright type="single" width="4"/>
           </v:shape>
-          <o:OLEObject Type="Embed" ProgID="Word.OpenDocumentText.12" ShapeID="_x0000_i1058" DrawAspect="Content" ObjectID="_1838997763" r:id="rId86"/>
+          <o:OLEObject Type="Embed" ProgID="Word.OpenDocumentText.12" ShapeID="_x0000_i1058" DrawAspect="Content" ObjectID="_1839324504" r:id="rId86"/>
         </w:object>
       </w:r>
     </w:p>
@@ -7828,14 +7828,14 @@
           <w:lang w:val="en-US"/>
         </w:rPr>
         <w:object w:dxaOrig="9026" w:dyaOrig="1686" w14:anchorId="45956E9F">
-          <v:shape id="_x0000_i1059" type="#_x0000_t75" style="width:451.3pt;height:84.3pt" o:ole="" o:bordertopcolor="this" o:borderleftcolor="this" o:borderbottomcolor="this" o:borderrightcolor="this">
+          <v:shape id="_x0000_i1059" type="#_x0000_t75" style="width:451.5pt;height:84pt" o:ole="" o:bordertopcolor="this" o:borderleftcolor="this" o:borderbottomcolor="this" o:borderrightcolor="this">
             <v:imagedata r:id="rId87" o:title=""/>
             <w10:bordertop type="single" width="4"/>
             <w10:borderleft type="single" width="4"/>
             <w10:borderbottom type="single" width="4"/>
             <w10:borderright type="single" width="4"/>
           </v:shape>
-          <o:OLEObject Type="Embed" ProgID="Word.OpenDocumentText.12" ShapeID="_x0000_i1059" DrawAspect="Content" ObjectID="_1838997764" r:id="rId88"/>
+          <o:OLEObject Type="Embed" ProgID="Word.OpenDocumentText.12" ShapeID="_x0000_i1059" DrawAspect="Content" ObjectID="_1839324505" r:id="rId88"/>
         </w:object>
       </w:r>
     </w:p>
@@ -7867,14 +7867,14 @@
           <w:lang w:val="en-US"/>
         </w:rPr>
         <w:object w:dxaOrig="9026" w:dyaOrig="562" w14:anchorId="2F246C0D">
-          <v:shape id="_x0000_i1060" type="#_x0000_t75" style="width:451.3pt;height:28.1pt" o:ole="" o:bordertopcolor="this" o:borderleftcolor="this" o:borderbottomcolor="this" o:borderrightcolor="this">
+          <v:shape id="_x0000_i1060" type="#_x0000_t75" style="width:451.5pt;height:27.75pt" o:ole="" o:bordertopcolor="this" o:borderleftcolor="this" o:borderbottomcolor="this" o:borderrightcolor="this">
             <v:imagedata r:id="rId89" o:title=""/>
             <w10:bordertop type="single" width="4"/>
             <w10:borderleft type="single" width="4"/>
             <w10:borderbottom type="single" width="4"/>
             <w10:borderright type="single" width="4"/>
           </v:shape>
-          <o:OLEObject Type="Embed" ProgID="Word.OpenDocumentText.12" ShapeID="_x0000_i1060" DrawAspect="Content" ObjectID="_1838997765" r:id="rId90"/>
+          <o:OLEObject Type="Embed" ProgID="Word.OpenDocumentText.12" ShapeID="_x0000_i1060" DrawAspect="Content" ObjectID="_1839324506" r:id="rId90"/>
         </w:object>
       </w:r>
     </w:p>
@@ -7918,14 +7918,14 @@
           <w:lang w:val="en-US"/>
         </w:rPr>
         <w:object w:dxaOrig="9026" w:dyaOrig="5386" w14:anchorId="4279DD1E">
-          <v:shape id="_x0000_i1061" type="#_x0000_t75" style="width:451.3pt;height:269.3pt" o:ole="" o:bordertopcolor="this" o:borderleftcolor="this" o:borderbottomcolor="this" o:borderrightcolor="this">
+          <v:shape id="_x0000_i1061" type="#_x0000_t75" style="width:451.5pt;height:269.25pt" o:ole="" o:bordertopcolor="this" o:borderleftcolor="this" o:borderbottomcolor="this" o:borderrightcolor="this">
             <v:imagedata r:id="rId91" o:title=""/>
             <w10:bordertop type="single" width="4"/>
             <w10:borderleft type="single" width="4"/>
             <w10:borderbottom type="single" width="4"/>
             <w10:borderright type="single" width="4"/>
           </v:shape>
-          <o:OLEObject Type="Embed" ProgID="Word.OpenDocumentText.12" ShapeID="_x0000_i1061" DrawAspect="Content" ObjectID="_1838997766" r:id="rId92"/>
+          <o:OLEObject Type="Embed" ProgID="Word.OpenDocumentText.12" ShapeID="_x0000_i1061" DrawAspect="Content" ObjectID="_1839324507" r:id="rId92"/>
         </w:object>
       </w:r>
     </w:p>
@@ -7998,14 +7998,14 @@
           <w:lang w:val="en-US"/>
         </w:rPr>
         <w:object w:dxaOrig="9026" w:dyaOrig="281" w14:anchorId="2BA615D3">
-          <v:shape id="_x0000_i1062" type="#_x0000_t75" style="width:451.3pt;height:13.85pt" o:ole="" o:bordertopcolor="this" o:borderleftcolor="this" o:borderbottomcolor="this" o:borderrightcolor="this">
+          <v:shape id="_x0000_i1062" type="#_x0000_t75" style="width:451.5pt;height:13.5pt" o:ole="" o:bordertopcolor="this" o:borderleftcolor="this" o:borderbottomcolor="this" o:borderrightcolor="this">
             <v:imagedata r:id="rId93" o:title=""/>
             <w10:bordertop type="single" width="4"/>
             <w10:borderleft type="single" width="4"/>
             <w10:borderbottom type="single" width="4"/>
             <w10:borderright type="single" width="4"/>
           </v:shape>
-          <o:OLEObject Type="Embed" ProgID="Word.OpenDocumentText.12" ShapeID="_x0000_i1062" DrawAspect="Content" ObjectID="_1838997767" r:id="rId94"/>
+          <o:OLEObject Type="Embed" ProgID="Word.OpenDocumentText.12" ShapeID="_x0000_i1062" DrawAspect="Content" ObjectID="_1839324508" r:id="rId94"/>
         </w:object>
       </w:r>
     </w:p>
@@ -8158,14 +8158,14 @@
           <w:lang w:val="en-US"/>
         </w:rPr>
         <w:object w:dxaOrig="9026" w:dyaOrig="1686" w14:anchorId="5F5B686D">
-          <v:shape id="_x0000_i1063" type="#_x0000_t75" style="width:451.3pt;height:84.3pt" o:ole="" o:bordertopcolor="this" o:borderleftcolor="this" o:borderbottomcolor="this" o:borderrightcolor="this">
+          <v:shape id="_x0000_i1063" type="#_x0000_t75" style="width:451.5pt;height:84pt" o:ole="" o:bordertopcolor="this" o:borderleftcolor="this" o:borderbottomcolor="this" o:borderrightcolor="this">
             <v:imagedata r:id="rId95" o:title=""/>
             <w10:bordertop type="single" width="4"/>
             <w10:borderleft type="single" width="4"/>
             <w10:borderbottom type="single" width="4"/>
             <w10:borderright type="single" width="4"/>
           </v:shape>
-          <o:OLEObject Type="Embed" ProgID="Word.OpenDocumentText.12" ShapeID="_x0000_i1063" DrawAspect="Content" ObjectID="_1838997768" r:id="rId96"/>
+          <o:OLEObject Type="Embed" ProgID="Word.OpenDocumentText.12" ShapeID="_x0000_i1063" DrawAspect="Content" ObjectID="_1839324509" r:id="rId96"/>
         </w:object>
       </w:r>
     </w:p>
@@ -8197,14 +8197,14 @@
           <w:lang w:val="en-US"/>
         </w:rPr>
         <w:object w:dxaOrig="9026" w:dyaOrig="1686" w14:anchorId="44FCC1DB">
-          <v:shape id="_x0000_i1064" type="#_x0000_t75" style="width:451.3pt;height:84.3pt" o:ole="" o:bordertopcolor="this" o:borderleftcolor="this" o:borderbottomcolor="this" o:borderrightcolor="this">
+          <v:shape id="_x0000_i1064" type="#_x0000_t75" style="width:451.5pt;height:84pt" o:ole="" o:bordertopcolor="this" o:borderleftcolor="this" o:borderbottomcolor="this" o:borderrightcolor="this">
             <v:imagedata r:id="rId97" o:title=""/>
             <w10:bordertop type="single" width="4"/>
             <w10:borderleft type="single" width="4"/>
             <w10:borderbottom type="single" width="4"/>
             <w10:borderright type="single" width="4"/>
           </v:shape>
-          <o:OLEObject Type="Embed" ProgID="Word.OpenDocumentText.12" ShapeID="_x0000_i1064" DrawAspect="Content" ObjectID="_1838997769" r:id="rId98"/>
+          <o:OLEObject Type="Embed" ProgID="Word.OpenDocumentText.12" ShapeID="_x0000_i1064" DrawAspect="Content" ObjectID="_1839324510" r:id="rId98"/>
         </w:object>
       </w:r>
     </w:p>
@@ -8258,14 +8258,14 @@
           <w:lang w:val="en-US"/>
         </w:rPr>
         <w:object w:dxaOrig="9026" w:dyaOrig="1639" w14:anchorId="5A699D0F">
-          <v:shape id="_x0000_i1065" type="#_x0000_t75" style="width:451.3pt;height:81.95pt" o:ole="" o:bordertopcolor="this" o:borderleftcolor="this" o:borderbottomcolor="this" o:borderrightcolor="this">
+          <v:shape id="_x0000_i1065" type="#_x0000_t75" style="width:451.5pt;height:81.75pt" o:ole="" o:bordertopcolor="this" o:borderleftcolor="this" o:borderbottomcolor="this" o:borderrightcolor="this">
             <v:imagedata r:id="rId99" o:title=""/>
             <w10:bordertop type="single" width="4"/>
             <w10:borderleft type="single" width="4"/>
             <w10:borderbottom type="single" width="4"/>
             <w10:borderright type="single" width="4"/>
           </v:shape>
-          <o:OLEObject Type="Embed" ProgID="Word.OpenDocumentText.12" ShapeID="_x0000_i1065" DrawAspect="Content" ObjectID="_1838997770" r:id="rId100"/>
+          <o:OLEObject Type="Embed" ProgID="Word.OpenDocumentText.12" ShapeID="_x0000_i1065" DrawAspect="Content" ObjectID="_1839324511" r:id="rId100"/>
         </w:object>
       </w:r>
     </w:p>
@@ -8361,14 +8361,14 @@
           <w:lang w:val="en-US"/>
         </w:rPr>
         <w:object w:dxaOrig="9026" w:dyaOrig="11943" w14:anchorId="389831CA">
-          <v:shape id="_x0000_i1066" type="#_x0000_t75" style="width:451.3pt;height:597.15pt" o:ole="" o:bordertopcolor="this" o:borderleftcolor="this" o:borderbottomcolor="this" o:borderrightcolor="this">
+          <v:shape id="_x0000_i1066" type="#_x0000_t75" style="width:451.5pt;height:597pt" o:ole="" o:bordertopcolor="this" o:borderleftcolor="this" o:borderbottomcolor="this" o:borderrightcolor="this">
             <v:imagedata r:id="rId101" o:title=""/>
             <w10:bordertop type="single" width="4"/>
             <w10:borderleft type="single" width="4"/>
             <w10:borderbottom type="single" width="4"/>
             <w10:borderright type="single" width="4"/>
           </v:shape>
-          <o:OLEObject Type="Embed" ProgID="Word.OpenDocumentText.12" ShapeID="_x0000_i1066" DrawAspect="Content" ObjectID="_1838997771" r:id="rId102"/>
+          <o:OLEObject Type="Embed" ProgID="Word.OpenDocumentText.12" ShapeID="_x0000_i1066" DrawAspect="Content" ObjectID="_1839324512" r:id="rId102"/>
         </w:object>
       </w:r>
     </w:p>
@@ -10311,7 +10311,7 @@
         <mc:AlternateContent>
           <mc:Choice Requires="wpg">
             <w:drawing>
-              <wp:anchor distT="0" distB="0" distL="114300" distR="114300" simplePos="0" relativeHeight="251694080" behindDoc="0" locked="0" layoutInCell="1" allowOverlap="1" wp14:anchorId="05ACB560" wp14:editId="0A664C07">
+              <wp:anchor distT="0" distB="0" distL="114300" distR="114300" simplePos="0" relativeHeight="251694080" behindDoc="0" locked="0" layoutInCell="1" allowOverlap="1" wp14:anchorId="05ACB560" wp14:editId="676744DF">
                 <wp:simplePos x="0" y="0"/>
                 <wp:positionH relativeFrom="column">
                   <wp:posOffset>4480993</wp:posOffset>
@@ -10343,7 +10343,7 @@
                             <a:picLocks noChangeAspect="1"/>
                           </pic:cNvPicPr>
                         </pic:nvPicPr>
-                        <pic:blipFill rotWithShape="1">
+                        <pic:blipFill>
                           <a:blip r:embed="rId103" cstate="print">
                             <a:extLst>
                               <a:ext uri="{28A0092B-C50C-407E-A947-70E740481C1C}">
@@ -10351,10 +10351,8 @@
                               </a:ext>
                             </a:extLst>
                           </a:blip>
-                          <a:srcRect l="16343"/>
-                          <a:stretch>
-                            <a:fillRect/>
-                          </a:stretch>
+                          <a:srcRect t="7208" b="7208"/>
+                          <a:stretch/>
                         </pic:blipFill>
                         <pic:spPr bwMode="auto">
                           <a:xfrm>
@@ -10444,9 +10442,9 @@
           </mc:Choice>
           <mc:Fallback>
             <w:pict>
-              <v:group w14:anchorId="05ACB560" id="Group 15" o:spid="_x0000_s1050" style="position:absolute;margin-left:352.85pt;margin-top:23.65pt;width:93.05pt;height:109.15pt;z-index:251694080" coordsize="11817,13862" o:gfxdata="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">
-                <v:shape id="Picture 1" o:spid="_x0000_s1051" type="#_x0000_t75" style="position:absolute;width:11817;height:9410;visibility:visible;mso-wrap-style:square" o:gfxdata="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">
-                  <v:imagedata r:id="rId104" o:title="" cropleft="10711f"/>
+              <v:group w14:anchorId="05ACB560" id="Group 15" o:spid="_x0000_s1050" style="position:absolute;margin-left:352.85pt;margin-top:23.65pt;width:93.05pt;height:109.15pt;z-index:251694080" coordsize="11817,13862" o:gfxdata="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">
+                <v:shape id="Picture 1" o:spid="_x0000_s1051" type="#_x0000_t75" style="position:absolute;width:11817;height:9410;visibility:visible;mso-wrap-style:square" o:gfxdata="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">
+                  <v:imagedata r:id="rId104" o:title="" croptop="4724f" cropbottom="4724f"/>
                   <v:shadow on="t" type="perspective" color="black" opacity="26214f" offset="0,0" matrix="66847f,,,66847f"/>
                 </v:shape>
                 <v:shape id="_x0000_s1052" type="#_x0000_t202" style="position:absolute;top:9963;width:11817;height:3899;visibility:visible;mso-wrap-style:square;v-text-anchor:top" o:gfxdata="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" stroked="f">
@@ -10494,7 +10492,7 @@
         <mc:AlternateContent>
           <mc:Choice Requires="wpg">
             <w:drawing>
-              <wp:anchor distT="0" distB="0" distL="114300" distR="114300" simplePos="0" relativeHeight="251691008" behindDoc="0" locked="0" layoutInCell="1" allowOverlap="1" wp14:anchorId="0AFE2008" wp14:editId="15E84330">
+              <wp:anchor distT="0" distB="0" distL="114300" distR="114300" simplePos="0" relativeHeight="251691008" behindDoc="0" locked="0" layoutInCell="1" allowOverlap="1" wp14:anchorId="0AFE2008" wp14:editId="61B13C68">
                 <wp:simplePos x="0" y="0"/>
                 <wp:positionH relativeFrom="column">
                   <wp:posOffset>3219901</wp:posOffset>
@@ -10503,7 +10501,7 @@
                   <wp:posOffset>300379</wp:posOffset>
                 </wp:positionV>
                 <wp:extent cx="1169670" cy="1390650"/>
-                <wp:effectExtent l="76200" t="76200" r="68580" b="0"/>
+                <wp:effectExtent l="38100" t="76200" r="49530" b="0"/>
                 <wp:wrapSquare wrapText="bothSides"/>
                 <wp:docPr id="721364822" name="Group 14"/>
                 <wp:cNvGraphicFramePr/>
@@ -10534,14 +10532,13 @@
                               </a:ext>
                             </a:extLst>
                           </a:blip>
-                          <a:stretch>
-                            <a:fillRect/>
-                          </a:stretch>
+                          <a:srcRect/>
+                          <a:stretch/>
                         </pic:blipFill>
                         <pic:spPr>
                           <a:xfrm>
-                            <a:off x="0" y="0"/>
-                            <a:ext cx="1169670" cy="941070"/>
+                            <a:off x="29247" y="0"/>
+                            <a:ext cx="1111175" cy="941070"/>
                           </a:xfrm>
                           <a:prstGeom prst="rect">
                             <a:avLst/>
@@ -10619,8 +10616,8 @@
           </mc:Choice>
           <mc:Fallback>
             <w:pict>
-              <v:group w14:anchorId="0AFE2008" id="Group 14" o:spid="_x0000_s1053" style="position:absolute;margin-left:253.55pt;margin-top:23.65pt;width:92.1pt;height:109.5pt;z-index:251691008" coordsize="11696,13906" o:gfxdata="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">
-                <v:shape id="Picture 1" o:spid="_x0000_s1054" type="#_x0000_t75" style="position:absolute;width:11696;height:9410;visibility:visible;mso-wrap-style:square" o:gfxdata="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">
+              <v:group w14:anchorId="0AFE2008" id="Group 14" o:spid="_x0000_s1053" style="position:absolute;margin-left:253.55pt;margin-top:23.65pt;width:92.1pt;height:109.5pt;z-index:251691008" coordsize="11696,13906" o:gfxdata="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">
+                <v:shape id="Picture 1" o:spid="_x0000_s1054" type="#_x0000_t75" style="position:absolute;left:292;width:11112;height:9410;visibility:visible;mso-wrap-style:square" o:gfxdata="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">
                   <v:imagedata r:id="rId106" o:title=""/>
                   <v:shadow on="t" type="perspective" color="black" opacity="26214f" offset="0,0" matrix="66847f,,,66847f"/>
                 </v:shape>
@@ -10708,7 +10705,7 @@
         <mc:AlternateContent>
           <mc:Choice Requires="wpg">
             <w:drawing>
-              <wp:anchor distT="0" distB="0" distL="114300" distR="114300" simplePos="0" relativeHeight="251698176" behindDoc="0" locked="0" layoutInCell="1" allowOverlap="1" wp14:anchorId="48AFB89A" wp14:editId="762A5A7A">
+              <wp:anchor distT="0" distB="0" distL="114300" distR="114300" simplePos="0" relativeHeight="251698176" behindDoc="0" locked="0" layoutInCell="1" allowOverlap="1" wp14:anchorId="48AFB89A" wp14:editId="02CBDB85">
                 <wp:simplePos x="0" y="0"/>
                 <wp:positionH relativeFrom="column">
                   <wp:posOffset>4255770</wp:posOffset>
@@ -10717,7 +10714,7 @@
                   <wp:posOffset>427355</wp:posOffset>
                 </wp:positionV>
                 <wp:extent cx="1407795" cy="1196340"/>
-                <wp:effectExtent l="95250" t="76200" r="97155" b="3810"/>
+                <wp:effectExtent l="0" t="76200" r="1905" b="3810"/>
                 <wp:wrapSquare wrapText="bothSides"/>
                 <wp:docPr id="1723418122" name="Group 16"/>
                 <wp:cNvGraphicFramePr/>
@@ -10748,14 +10745,13 @@
                               </a:ext>
                             </a:extLst>
                           </a:blip>
-                          <a:stretch>
-                            <a:fillRect/>
-                          </a:stretch>
+                          <a:srcRect/>
+                          <a:stretch/>
                         </pic:blipFill>
                         <pic:spPr>
                           <a:xfrm>
-                            <a:off x="0" y="0"/>
-                            <a:ext cx="1407795" cy="873760"/>
+                            <a:off x="132079" y="0"/>
+                            <a:ext cx="1143636" cy="873760"/>
                           </a:xfrm>
                           <a:prstGeom prst="rect">
                             <a:avLst/>
@@ -10842,8 +10838,8 @@
           </mc:Choice>
           <mc:Fallback>
             <w:pict>
-              <v:group w14:anchorId="48AFB89A" id="Group 16" o:spid="_x0000_s1056" style="position:absolute;margin-left:335.1pt;margin-top:33.65pt;width:110.85pt;height:94.2pt;z-index:251698176" coordsize="14077,11963" o:gfxdata="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">
-                <v:shape id="Picture 1" o:spid="_x0000_s1057" type="#_x0000_t75" style="position:absolute;width:14077;height:8737;visibility:visible;mso-wrap-style:square" o:gfxdata="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">
+              <v:group w14:anchorId="48AFB89A" id="Group 16" o:spid="_x0000_s1056" style="position:absolute;margin-left:335.1pt;margin-top:33.65pt;width:110.85pt;height:94.2pt;z-index:251698176" coordsize="14077,11963" o:gfxdata="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">
+                <v:shape id="Picture 1" o:spid="_x0000_s1057" type="#_x0000_t75" style="position:absolute;left:1320;width:11437;height:8737;visibility:visible;mso-wrap-style:square" o:gfxdata="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">
                   <v:imagedata r:id="rId108" o:title=""/>
                   <v:shadow on="t" type="perspective" color="black" opacity="26214f" offset="0,0" matrix="66847f,,,66847f"/>
                 </v:shape>
@@ -10949,7 +10945,7 @@
         <mc:AlternateContent>
           <mc:Choice Requires="wpg">
             <w:drawing>
-              <wp:anchor distT="0" distB="0" distL="114300" distR="114300" simplePos="0" relativeHeight="251702272" behindDoc="0" locked="0" layoutInCell="1" allowOverlap="1" wp14:anchorId="553BD459" wp14:editId="09BF10DE">
+              <wp:anchor distT="0" distB="0" distL="114300" distR="114300" simplePos="0" relativeHeight="251702272" behindDoc="0" locked="0" layoutInCell="1" allowOverlap="1" wp14:anchorId="553BD459" wp14:editId="018C6A04">
                 <wp:simplePos x="0" y="0"/>
                 <wp:positionH relativeFrom="column">
                   <wp:posOffset>3930650</wp:posOffset>
@@ -10958,7 +10954,7 @@
                   <wp:posOffset>56086</wp:posOffset>
                 </wp:positionV>
                 <wp:extent cx="1731645" cy="1640840"/>
-                <wp:effectExtent l="95250" t="76200" r="97155" b="0"/>
+                <wp:effectExtent l="95250" t="0" r="97155" b="0"/>
                 <wp:wrapSquare wrapText="bothSides"/>
                 <wp:docPr id="2004569580" name="Group 17"/>
                 <wp:cNvGraphicFramePr/>
@@ -10968,10 +10964,10 @@
                       <wpg:cNvGrpSpPr/>
                       <wpg:grpSpPr>
                         <a:xfrm>
-                          <a:off x="0" y="0"/>
-                          <a:ext cx="1731645" cy="1640840"/>
-                          <a:chOff x="0" y="0"/>
-                          <a:chExt cx="1731645" cy="1640840"/>
+                          <a:off x="0" y="98275"/>
+                          <a:ext cx="1731645" cy="1542565"/>
+                          <a:chOff x="0" y="98275"/>
+                          <a:chExt cx="1731645" cy="1542565"/>
                         </a:xfrm>
                       </wpg:grpSpPr>
                       <pic:pic xmlns:pic="http://schemas.openxmlformats.org/drawingml/2006/picture">
@@ -10989,14 +10985,13 @@
                               </a:ext>
                             </a:extLst>
                           </a:blip>
-                          <a:stretch>
-                            <a:fillRect/>
-                          </a:stretch>
+                          <a:srcRect/>
+                          <a:stretch/>
                         </pic:blipFill>
                         <pic:spPr>
                           <a:xfrm>
-                            <a:off x="0" y="0"/>
-                            <a:ext cx="1731645" cy="1193165"/>
+                            <a:off x="0" y="98275"/>
+                            <a:ext cx="1731645" cy="996614"/>
                           </a:xfrm>
                           <a:prstGeom prst="rect">
                             <a:avLst/>
@@ -11100,8 +11095,8 @@
           </mc:Choice>
           <mc:Fallback>
             <w:pict>
-              <v:group w14:anchorId="553BD459" id="Group 17" o:spid="_x0000_s1059" style="position:absolute;left:0;text-align:left;margin-left:309.5pt;margin-top:4.4pt;width:136.35pt;height:129.2pt;z-index:251702272" coordsize="17316,16408" o:gfxdata="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">
-                <v:shape id="Picture 1" o:spid="_x0000_s1060" type="#_x0000_t75" style="position:absolute;width:17316;height:11931;visibility:visible;mso-wrap-style:square" o:gfxdata="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">
+              <v:group w14:anchorId="553BD459" id="Group 17" o:spid="_x0000_s1059" style="position:absolute;left:0;text-align:left;margin-left:309.5pt;margin-top:4.4pt;width:136.35pt;height:129.2pt;z-index:251702272" coordorigin=",982" coordsize="17316,15425" o:gfxdata="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">
+                <v:shape id="Picture 1" o:spid="_x0000_s1060" type="#_x0000_t75" style="position:absolute;top:982;width:17316;height:9966;visibility:visible;mso-wrap-style:square" o:gfxdata="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">
                   <v:imagedata r:id="rId110" o:title=""/>
                   <v:shadow on="t" type="perspective" color="black" opacity="26214f" offset="0,0" matrix="66847f,,,66847f"/>
                 </v:shape>
@@ -11264,7 +11259,13 @@
         <w:t xml:space="preserve"> dintr-un pin de ieșire într-un pin de intrare legați prin conectori. </w:t>
       </w:r>
       <w:r>
-        <w:t>Apoi fiecare circuit integrat execută logica internă, în mod recursiv, dacă este format din alte circuite integrate.</w:t>
+        <w:t xml:space="preserve">Apoi fiecare </w:t>
+      </w:r>
+      <w:r>
+        <w:t>poartă logică de bază ȘI-NU execută logica. Deoarece fiecare circuit este compus din aceste porți logice execuția lor este garantată prin execuția porților logice de bază</w:t>
+      </w:r>
+      <w:r>
+        <w:t>.</w:t>
       </w:r>
       <w:r>
         <w:t xml:space="preserve"> Starea fiecărui pin este memorată </w:t>
@@ -11513,14 +11514,14 @@
           <w:lang w:val="en-US"/>
         </w:rPr>
         <w:object w:dxaOrig="9026" w:dyaOrig="281" w14:anchorId="7167DDE9">
-          <v:shape id="_x0000_i1067" type="#_x0000_t75" style="width:451.3pt;height:13.85pt" o:ole="" o:bordertopcolor="this" o:borderleftcolor="this" o:borderbottomcolor="this" o:borderrightcolor="this">
+          <v:shape id="_x0000_i1067" type="#_x0000_t75" style="width:451.5pt;height:13.5pt" o:ole="" o:bordertopcolor="this" o:borderleftcolor="this" o:borderbottomcolor="this" o:borderrightcolor="this">
             <v:imagedata r:id="rId114" o:title=""/>
             <w10:bordertop type="single" width="4"/>
             <w10:borderleft type="single" width="4"/>
             <w10:borderbottom type="single" width="4"/>
             <w10:borderright type="single" width="4"/>
           </v:shape>
-          <o:OLEObject Type="Embed" ProgID="Word.OpenDocumentText.12" ShapeID="_x0000_i1067" DrawAspect="Content" ObjectID="_1838997772" r:id="rId115"/>
+          <o:OLEObject Type="Embed" ProgID="Word.OpenDocumentText.12" ShapeID="_x0000_i1067" DrawAspect="Content" ObjectID="_1839324513" r:id="rId115"/>
         </w:object>
       </w:r>
     </w:p>
@@ -11552,14 +11553,14 @@
           <w:lang w:val="en-US"/>
         </w:rPr>
         <w:object w:dxaOrig="9026" w:dyaOrig="281" w14:anchorId="4F98D2CA">
-          <v:shape id="_x0000_i1068" type="#_x0000_t75" style="width:451.3pt;height:13.85pt" o:ole="" o:bordertopcolor="this" o:borderleftcolor="this" o:borderbottomcolor="this" o:borderrightcolor="this">
+          <v:shape id="_x0000_i1068" type="#_x0000_t75" style="width:451.5pt;height:13.5pt" o:ole="" o:bordertopcolor="this" o:borderleftcolor="this" o:borderbottomcolor="this" o:borderrightcolor="this">
             <v:imagedata r:id="rId116" o:title=""/>
             <w10:bordertop type="single" width="4"/>
             <w10:borderleft type="single" width="4"/>
             <w10:borderbottom type="single" width="4"/>
             <w10:borderright type="single" width="4"/>
           </v:shape>
-          <o:OLEObject Type="Embed" ProgID="Word.OpenDocumentText.12" ShapeID="_x0000_i1068" DrawAspect="Content" ObjectID="_1838997773" r:id="rId117"/>
+          <o:OLEObject Type="Embed" ProgID="Word.OpenDocumentText.12" ShapeID="_x0000_i1068" DrawAspect="Content" ObjectID="_1839324514" r:id="rId117"/>
         </w:object>
       </w:r>
     </w:p>
@@ -11577,14 +11578,14 @@
           <w:lang w:val="en-US"/>
         </w:rPr>
         <w:object w:dxaOrig="9026" w:dyaOrig="281" w14:anchorId="4BB36273">
-          <v:shape id="_x0000_i1069" type="#_x0000_t75" style="width:451.3pt;height:13.85pt" o:ole="" o:bordertopcolor="this" o:borderleftcolor="this" o:borderbottomcolor="this" o:borderrightcolor="this">
+          <v:shape id="_x0000_i1069" type="#_x0000_t75" style="width:451.5pt;height:13.5pt" o:ole="" o:bordertopcolor="this" o:borderleftcolor="this" o:borderbottomcolor="this" o:borderrightcolor="this">
             <v:imagedata r:id="rId118" o:title=""/>
             <w10:bordertop type="single" width="4"/>
             <w10:borderleft type="single" width="4"/>
             <w10:borderbottom type="single" width="4"/>
             <w10:borderright type="single" width="4"/>
           </v:shape>
-          <o:OLEObject Type="Embed" ProgID="Word.OpenDocumentText.12" ShapeID="_x0000_i1069" DrawAspect="Content" ObjectID="_1838997774" r:id="rId119"/>
+          <o:OLEObject Type="Embed" ProgID="Word.OpenDocumentText.12" ShapeID="_x0000_i1069" DrawAspect="Content" ObjectID="_1839324515" r:id="rId119"/>
         </w:object>
       </w:r>
     </w:p>
@@ -11628,14 +11629,14 @@
           <w:lang w:val="en-US"/>
         </w:rPr>
         <w:object w:dxaOrig="9026" w:dyaOrig="281" w14:anchorId="3E996432">
-          <v:shape id="_x0000_i1070" type="#_x0000_t75" style="width:451.3pt;height:13.85pt" o:ole="" o:bordertopcolor="this" o:borderleftcolor="this" o:borderbottomcolor="this" o:borderrightcolor="this">
+          <v:shape id="_x0000_i1070" type="#_x0000_t75" style="width:451.5pt;height:13.5pt" o:ole="" o:bordertopcolor="this" o:borderleftcolor="this" o:borderbottomcolor="this" o:borderrightcolor="this">
             <v:imagedata r:id="rId120" o:title=""/>
             <w10:bordertop type="single" width="4"/>
             <w10:borderleft type="single" width="4"/>
             <w10:borderbottom type="single" width="4"/>
             <w10:borderright type="single" width="4"/>
           </v:shape>
-          <o:OLEObject Type="Embed" ProgID="Word.OpenDocumentText.12" ShapeID="_x0000_i1070" DrawAspect="Content" ObjectID="_1838997775" r:id="rId121"/>
+          <o:OLEObject Type="Embed" ProgID="Word.OpenDocumentText.12" ShapeID="_x0000_i1070" DrawAspect="Content" ObjectID="_1839324516" r:id="rId121"/>
         </w:object>
       </w:r>
     </w:p>
@@ -11709,14 +11710,14 @@
           <w:lang w:val="en-US"/>
         </w:rPr>
         <w:object w:dxaOrig="9026" w:dyaOrig="281" w14:anchorId="3D9F4D62">
-          <v:shape id="_x0000_i1071" type="#_x0000_t75" style="width:451.3pt;height:13.85pt" o:ole="" o:bordertopcolor="this" o:borderleftcolor="this" o:borderbottomcolor="this" o:borderrightcolor="this">
+          <v:shape id="_x0000_i1071" type="#_x0000_t75" style="width:451.5pt;height:13.5pt" o:ole="" o:bordertopcolor="this" o:borderleftcolor="this" o:borderbottomcolor="this" o:borderrightcolor="this">
             <v:imagedata r:id="rId122" o:title=""/>
             <w10:bordertop type="single" width="4"/>
             <w10:borderleft type="single" width="4"/>
             <w10:borderbottom type="single" width="4"/>
             <w10:borderright type="single" width="4"/>
           </v:shape>
-          <o:OLEObject Type="Embed" ProgID="Word.OpenDocumentText.12" ShapeID="_x0000_i1071" DrawAspect="Content" ObjectID="_1838997776" r:id="rId123"/>
+          <o:OLEObject Type="Embed" ProgID="Word.OpenDocumentText.12" ShapeID="_x0000_i1071" DrawAspect="Content" ObjectID="_1839324517" r:id="rId123"/>
         </w:object>
       </w:r>
     </w:p>
@@ -11789,7 +11790,16 @@
         <w:rPr>
           <w:lang w:val="en-US"/>
         </w:rPr>
-        <w:t>Aplicația finală prezintă o interfață grafică ușor de înțeles și încurajează explorarea circuitelor și comportamentul intern al electronicelor prin logică binară. În continuare vom prezenta exemple pentru implementarea unor operații logice și unități rudimentare de logică matematică.</w:t>
+        <w:t>Aplicația finală prezintă o interfață grafică ușor de înțeles și încurajează explorarea circuitelor și comportamentul intern al electronicelor prin logică binară.</w:t>
+      </w:r>
+      <w:r>
+        <w:rPr>
+          <w:lang w:val="en-US"/>
+        </w:rPr>
+        <w:t xml:space="preserve"> </w:t>
+      </w:r>
+      <w:r>
+        <w:t>În continuare vom prezenta exemple pentru implementarea unor operații logice și unități rudimentare de logică matematică.</w:t>
       </w:r>
     </w:p>
     <w:p>
@@ -11960,9 +11970,9 @@
           <w:lang w:val="en-US"/>
         </w:rPr>
         <w:drawing>
-          <wp:inline distT="0" distB="0" distL="0" distR="0" wp14:anchorId="2DEDF401" wp14:editId="76B23291">
-            <wp:extent cx="3600000" cy="981447"/>
-            <wp:effectExtent l="114300" t="76200" r="95885" b="85725"/>
+          <wp:inline distT="0" distB="0" distL="0" distR="0" wp14:anchorId="2DEDF401" wp14:editId="61367FE9">
+            <wp:extent cx="3258185" cy="889588"/>
+            <wp:effectExtent l="114300" t="76200" r="113665" b="82550"/>
             <wp:docPr id="228509025" name="Picture 1"/>
             <wp:cNvGraphicFramePr>
               <a:graphicFrameLocks xmlns:a="http://schemas.openxmlformats.org/drawingml/2006/main" noChangeAspect="1"/>
@@ -11989,7 +11999,7 @@
                   <pic:spPr>
                     <a:xfrm>
                       <a:off x="0" y="0"/>
-                      <a:ext cx="3600000" cy="981447"/>
+                      <a:ext cx="3312680" cy="904467"/>
                     </a:xfrm>
                     <a:prstGeom prst="rect">
                       <a:avLst/>
@@ -12341,9 +12351,9 @@
           <w:lang w:val="en-US"/>
         </w:rPr>
         <w:drawing>
-          <wp:inline distT="0" distB="0" distL="0" distR="0" wp14:anchorId="7E638A40" wp14:editId="39D65D09">
-            <wp:extent cx="3600000" cy="1109994"/>
-            <wp:effectExtent l="114300" t="76200" r="95885" b="71120"/>
+          <wp:inline distT="0" distB="0" distL="0" distR="0" wp14:anchorId="7E638A40" wp14:editId="0FE50D28">
+            <wp:extent cx="3347357" cy="881422"/>
+            <wp:effectExtent l="95250" t="76200" r="100965" b="71120"/>
             <wp:docPr id="2061934819" name="Picture 1"/>
             <wp:cNvGraphicFramePr>
               <a:graphicFrameLocks xmlns:a="http://schemas.openxmlformats.org/drawingml/2006/main" noChangeAspect="1"/>
@@ -12356,7 +12366,13 @@
                     <pic:cNvPicPr/>
                   </pic:nvPicPr>
                   <pic:blipFill>
-                    <a:blip r:embed="rId125"/>
+                    <a:blip r:embed="rId125" cstate="print">
+                      <a:extLst>
+                        <a:ext uri="{28A0092B-C50C-407E-A947-70E740481C1C}">
+                          <a14:useLocalDpi xmlns:a14="http://schemas.microsoft.com/office/drawing/2010/main" val="0"/>
+                        </a:ext>
+                      </a:extLst>
+                    </a:blip>
                     <a:stretch>
                       <a:fillRect/>
                     </a:stretch>
@@ -12364,7 +12380,7 @@
                   <pic:spPr>
                     <a:xfrm>
                       <a:off x="0" y="0"/>
-                      <a:ext cx="3600000" cy="1109994"/>
+                      <a:ext cx="3373147" cy="888213"/>
                     </a:xfrm>
                     <a:prstGeom prst="rect">
                       <a:avLst/>
@@ -12716,9 +12732,9 @@
           <w:lang w:val="en-US"/>
         </w:rPr>
         <w:drawing>
-          <wp:inline distT="0" distB="0" distL="0" distR="0" wp14:anchorId="1D43B7D5" wp14:editId="7E1E97CB">
-            <wp:extent cx="3600000" cy="1253061"/>
-            <wp:effectExtent l="114300" t="76200" r="95885" b="80645"/>
+          <wp:inline distT="0" distB="0" distL="0" distR="0" wp14:anchorId="1D43B7D5" wp14:editId="4C1655C4">
+            <wp:extent cx="3258292" cy="1067337"/>
+            <wp:effectExtent l="114300" t="76200" r="113665" b="76200"/>
             <wp:docPr id="1725339314" name="Picture 1"/>
             <wp:cNvGraphicFramePr>
               <a:graphicFrameLocks xmlns:a="http://schemas.openxmlformats.org/drawingml/2006/main" noChangeAspect="1"/>
@@ -12745,7 +12761,7 @@
                   <pic:spPr>
                     <a:xfrm>
                       <a:off x="0" y="0"/>
-                      <a:ext cx="3600000" cy="1253061"/>
+                      <a:ext cx="3281492" cy="1074937"/>
                     </a:xfrm>
                     <a:prstGeom prst="rect">
                       <a:avLst/>
@@ -13097,9 +13113,9 @@
           <w:lang w:val="en-US"/>
         </w:rPr>
         <w:drawing>
-          <wp:inline distT="0" distB="0" distL="0" distR="0" wp14:anchorId="0F01E69B" wp14:editId="7D6DF360">
-            <wp:extent cx="3600000" cy="1408404"/>
-            <wp:effectExtent l="114300" t="95250" r="95885" b="97155"/>
+          <wp:inline distT="0" distB="0" distL="0" distR="0" wp14:anchorId="0F01E69B" wp14:editId="514285E7">
+            <wp:extent cx="3600000" cy="1371727"/>
+            <wp:effectExtent l="114300" t="95250" r="95885" b="95250"/>
             <wp:docPr id="1243136120" name="Picture 1"/>
             <wp:cNvGraphicFramePr>
               <a:graphicFrameLocks xmlns:a="http://schemas.openxmlformats.org/drawingml/2006/main" noChangeAspect="1"/>
@@ -13126,7 +13142,7 @@
                   <pic:spPr>
                     <a:xfrm>
                       <a:off x="0" y="0"/>
-                      <a:ext cx="3600000" cy="1408404"/>
+                      <a:ext cx="3600000" cy="1371727"/>
                     </a:xfrm>
                     <a:prstGeom prst="rect">
                       <a:avLst/>
@@ -13149,1071 +13165,15 @@
     <w:p>
       <w:pPr>
         <w:rPr>
-          <w:lang w:val="en-US"/>
-        </w:rPr>
-      </w:pPr>
-    </w:p>
-    <w:p>
-      <w:pPr>
-        <w:pStyle w:val="Subtitle"/>
-        <w:rPr>
-          <w:lang w:val="ro-RO"/>
-        </w:rPr>
-      </w:pPr>
-      <w:r>
-        <w:rPr>
-          <w:lang w:val="en-US"/>
-        </w:rPr>
-        <w:lastRenderedPageBreak/>
-        <w:t xml:space="preserve">Adunare a </w:t>
-      </w:r>
-      <w:r>
-        <w:rPr>
-          <w:lang w:val="en-US"/>
-        </w:rPr>
-        <w:t>2</w:t>
-      </w:r>
-      <w:r>
-        <w:rPr>
-          <w:lang w:val="en-US"/>
-        </w:rPr>
-        <w:t xml:space="preserve"> bi</w:t>
-      </w:r>
-      <w:r>
-        <w:rPr>
-          <w:lang w:val="ro-RO"/>
-        </w:rPr>
-        <w:t>ți</w:t>
-      </w:r>
-    </w:p>
-    <w:p>
-      <w:pPr>
-        <w:rPr>
-          <w:lang w:val="ro-RO"/>
-        </w:rPr>
-      </w:pPr>
-      <w:r>
-        <w:rPr>
-          <w:noProof/>
-          <w:lang w:val="ro-RO"/>
-        </w:rPr>
-        <w:drawing>
-          <wp:inline distT="0" distB="0" distL="0" distR="0" wp14:anchorId="0B657C9F" wp14:editId="2DFC8085">
-            <wp:extent cx="5400000" cy="2479836"/>
-            <wp:effectExtent l="114300" t="95250" r="106045" b="92075"/>
-            <wp:docPr id="1536145776" name="Picture 1"/>
-            <wp:cNvGraphicFramePr>
-              <a:graphicFrameLocks xmlns:a="http://schemas.openxmlformats.org/drawingml/2006/main" noChangeAspect="1"/>
-            </wp:cNvGraphicFramePr>
-            <a:graphic xmlns:a="http://schemas.openxmlformats.org/drawingml/2006/main">
-              <a:graphicData uri="http://schemas.openxmlformats.org/drawingml/2006/picture">
-                <pic:pic xmlns:pic="http://schemas.openxmlformats.org/drawingml/2006/picture">
-                  <pic:nvPicPr>
-                    <pic:cNvPr id="1536145776" name=""/>
-                    <pic:cNvPicPr/>
-                  </pic:nvPicPr>
-                  <pic:blipFill>
-                    <a:blip r:embed="rId128"/>
-                    <a:stretch>
-                      <a:fillRect/>
-                    </a:stretch>
-                  </pic:blipFill>
-                  <pic:spPr>
-                    <a:xfrm>
-                      <a:off x="0" y="0"/>
-                      <a:ext cx="5400000" cy="2479836"/>
-                    </a:xfrm>
-                    <a:prstGeom prst="rect">
-                      <a:avLst/>
-                    </a:prstGeom>
-                    <a:effectLst>
-                      <a:outerShdw blurRad="63500" sx="102000" sy="102000" algn="ctr" rotWithShape="0">
-                        <a:prstClr val="black">
-                          <a:alpha val="40000"/>
-                        </a:prstClr>
-                      </a:outerShdw>
-                    </a:effectLst>
-                  </pic:spPr>
-                </pic:pic>
-              </a:graphicData>
-            </a:graphic>
-          </wp:inline>
-        </w:drawing>
-      </w:r>
-    </w:p>
-    <w:tbl>
-      <w:tblPr>
-        <w:tblStyle w:val="TableGrid"/>
-        <w:tblpPr w:leftFromText="180" w:rightFromText="180" w:vertAnchor="text" w:horzAnchor="margin" w:tblpXSpec="center" w:tblpY="18"/>
-        <w:tblW w:w="0" w:type="auto"/>
-        <w:tblLook w:val="04A0" w:firstRow="1" w:lastRow="0" w:firstColumn="1" w:lastColumn="0" w:noHBand="0" w:noVBand="1"/>
-      </w:tblPr>
-      <w:tblGrid>
-        <w:gridCol w:w="1004"/>
-        <w:gridCol w:w="1004"/>
-        <w:gridCol w:w="1005"/>
-        <w:gridCol w:w="1163"/>
-        <w:gridCol w:w="1163"/>
-      </w:tblGrid>
-      <w:tr>
-        <w:trPr>
-          <w:trHeight w:val="340"/>
-        </w:trPr>
-        <w:tc>
-          <w:tcPr>
-            <w:tcW w:w="3013" w:type="dxa"/>
-            <w:gridSpan w:val="3"/>
-          </w:tcPr>
-          <w:p>
-            <w:pPr>
-              <w:jc w:val="center"/>
-              <w:rPr>
-                <w:lang w:val="en-US"/>
-              </w:rPr>
-            </w:pPr>
-            <w:r>
-              <w:rPr>
-                <w:lang w:val="en-US"/>
-              </w:rPr>
-              <w:t>INPUT</w:t>
-            </w:r>
-          </w:p>
-        </w:tc>
-        <w:tc>
-          <w:tcPr>
-            <w:tcW w:w="2326" w:type="dxa"/>
-            <w:gridSpan w:val="2"/>
-          </w:tcPr>
-          <w:p>
-            <w:pPr>
-              <w:jc w:val="center"/>
-              <w:rPr>
-                <w:lang w:val="en-US"/>
-              </w:rPr>
-            </w:pPr>
-            <w:r>
-              <w:rPr>
-                <w:lang w:val="en-US"/>
-              </w:rPr>
-              <w:t>OUTPUT</w:t>
-            </w:r>
-          </w:p>
-        </w:tc>
-      </w:tr>
-      <w:tr>
-        <w:trPr>
-          <w:trHeight w:val="349"/>
-        </w:trPr>
-        <w:tc>
-          <w:tcPr>
-            <w:tcW w:w="1004" w:type="dxa"/>
-          </w:tcPr>
-          <w:p>
-            <w:pPr>
-              <w:jc w:val="center"/>
-              <w:rPr>
-                <w:lang w:val="en-US"/>
-              </w:rPr>
-            </w:pPr>
-            <w:r>
-              <w:rPr>
-                <w:lang w:val="en-US"/>
-              </w:rPr>
-              <w:t>A</w:t>
-            </w:r>
-          </w:p>
-        </w:tc>
-        <w:tc>
-          <w:tcPr>
-            <w:tcW w:w="1004" w:type="dxa"/>
-          </w:tcPr>
-          <w:p>
-            <w:pPr>
-              <w:jc w:val="center"/>
-              <w:rPr>
-                <w:lang w:val="en-US"/>
-              </w:rPr>
-            </w:pPr>
-            <w:r>
-              <w:rPr>
-                <w:lang w:val="en-US"/>
-              </w:rPr>
-              <w:t>B</w:t>
-            </w:r>
-          </w:p>
-        </w:tc>
-        <w:tc>
-          <w:tcPr>
-            <w:tcW w:w="1005" w:type="dxa"/>
-          </w:tcPr>
-          <w:p>
-            <w:pPr>
-              <w:jc w:val="center"/>
-              <w:rPr>
-                <w:lang w:val="en-US"/>
-              </w:rPr>
-            </w:pPr>
-            <w:r>
-              <w:rPr>
-                <w:lang w:val="en-US"/>
-              </w:rPr>
-              <w:t>Carry</w:t>
-            </w:r>
-          </w:p>
-        </w:tc>
-        <w:tc>
-          <w:tcPr>
-            <w:tcW w:w="1163" w:type="dxa"/>
-          </w:tcPr>
-          <w:p>
-            <w:pPr>
-              <w:jc w:val="center"/>
-              <w:rPr>
-                <w:lang w:val="en-US"/>
-              </w:rPr>
-            </w:pPr>
-            <w:r>
-              <w:rPr>
-                <w:lang w:val="en-US"/>
-              </w:rPr>
-              <w:t>Sum</w:t>
-            </w:r>
-          </w:p>
-        </w:tc>
-        <w:tc>
-          <w:tcPr>
-            <w:tcW w:w="1163" w:type="dxa"/>
-          </w:tcPr>
-          <w:p>
-            <w:pPr>
-              <w:jc w:val="center"/>
-              <w:rPr>
-                <w:lang w:val="en-US"/>
-              </w:rPr>
-            </w:pPr>
-            <w:r>
-              <w:rPr>
-                <w:lang w:val="en-US"/>
-              </w:rPr>
-              <w:t>Carry</w:t>
-            </w:r>
-          </w:p>
-        </w:tc>
-      </w:tr>
-      <w:tr>
-        <w:trPr>
-          <w:trHeight w:val="340"/>
-        </w:trPr>
-        <w:tc>
-          <w:tcPr>
-            <w:tcW w:w="1004" w:type="dxa"/>
-          </w:tcPr>
-          <w:p>
-            <w:pPr>
-              <w:jc w:val="center"/>
-              <w:rPr>
-                <w:lang w:val="en-US"/>
-              </w:rPr>
-            </w:pPr>
-            <w:r>
-              <w:rPr>
-                <w:lang w:val="en-US"/>
-              </w:rPr>
-              <w:t>0</w:t>
-            </w:r>
-          </w:p>
-        </w:tc>
-        <w:tc>
-          <w:tcPr>
-            <w:tcW w:w="1004" w:type="dxa"/>
-          </w:tcPr>
-          <w:p>
-            <w:pPr>
-              <w:jc w:val="center"/>
-              <w:rPr>
-                <w:lang w:val="en-US"/>
-              </w:rPr>
-            </w:pPr>
-            <w:r>
-              <w:rPr>
-                <w:lang w:val="en-US"/>
-              </w:rPr>
-              <w:t>0</w:t>
-            </w:r>
-          </w:p>
-        </w:tc>
-        <w:tc>
-          <w:tcPr>
-            <w:tcW w:w="1005" w:type="dxa"/>
-          </w:tcPr>
-          <w:p>
-            <w:pPr>
-              <w:jc w:val="center"/>
-              <w:rPr>
-                <w:lang w:val="en-US"/>
-              </w:rPr>
-            </w:pPr>
-            <w:r>
-              <w:rPr>
-                <w:lang w:val="en-US"/>
-              </w:rPr>
-              <w:t>0</w:t>
-            </w:r>
-          </w:p>
-        </w:tc>
-        <w:tc>
-          <w:tcPr>
-            <w:tcW w:w="1163" w:type="dxa"/>
-          </w:tcPr>
-          <w:p>
-            <w:pPr>
-              <w:jc w:val="center"/>
-              <w:rPr>
-                <w:lang w:val="en-US"/>
-              </w:rPr>
-            </w:pPr>
-            <w:r>
-              <w:rPr>
-                <w:lang w:val="en-US"/>
-              </w:rPr>
-              <w:t>0</w:t>
-            </w:r>
-          </w:p>
-        </w:tc>
-        <w:tc>
-          <w:tcPr>
-            <w:tcW w:w="1163" w:type="dxa"/>
-          </w:tcPr>
-          <w:p>
-            <w:pPr>
-              <w:jc w:val="center"/>
-              <w:rPr>
-                <w:lang w:val="en-US"/>
-              </w:rPr>
-            </w:pPr>
-            <w:r>
-              <w:rPr>
-                <w:lang w:val="en-US"/>
-              </w:rPr>
-              <w:t>0</w:t>
-            </w:r>
-          </w:p>
-        </w:tc>
-      </w:tr>
-      <w:tr>
-        <w:trPr>
-          <w:trHeight w:val="340"/>
-        </w:trPr>
-        <w:tc>
-          <w:tcPr>
-            <w:tcW w:w="1004" w:type="dxa"/>
-          </w:tcPr>
-          <w:p>
-            <w:pPr>
-              <w:jc w:val="center"/>
-              <w:rPr>
-                <w:lang w:val="en-US"/>
-              </w:rPr>
-            </w:pPr>
-            <w:r>
-              <w:rPr>
-                <w:lang w:val="en-US"/>
-              </w:rPr>
-              <w:t>0</w:t>
-            </w:r>
-          </w:p>
-        </w:tc>
-        <w:tc>
-          <w:tcPr>
-            <w:tcW w:w="1004" w:type="dxa"/>
-          </w:tcPr>
-          <w:p>
-            <w:pPr>
-              <w:jc w:val="center"/>
-              <w:rPr>
-                <w:lang w:val="en-US"/>
-              </w:rPr>
-            </w:pPr>
-            <w:r>
-              <w:rPr>
-                <w:lang w:val="en-US"/>
-              </w:rPr>
-              <w:t>0</w:t>
-            </w:r>
-          </w:p>
-        </w:tc>
-        <w:tc>
-          <w:tcPr>
-            <w:tcW w:w="1005" w:type="dxa"/>
-          </w:tcPr>
-          <w:p>
-            <w:pPr>
-              <w:jc w:val="center"/>
-              <w:rPr>
-                <w:lang w:val="en-US"/>
-              </w:rPr>
-            </w:pPr>
-            <w:r>
-              <w:rPr>
-                <w:lang w:val="en-US"/>
-              </w:rPr>
-              <w:t>1</w:t>
-            </w:r>
-          </w:p>
-        </w:tc>
-        <w:tc>
-          <w:tcPr>
-            <w:tcW w:w="1163" w:type="dxa"/>
-          </w:tcPr>
-          <w:p>
-            <w:pPr>
-              <w:jc w:val="center"/>
-              <w:rPr>
-                <w:lang w:val="en-US"/>
-              </w:rPr>
-            </w:pPr>
-            <w:r>
-              <w:rPr>
-                <w:lang w:val="en-US"/>
-              </w:rPr>
-              <w:t>0</w:t>
-            </w:r>
-          </w:p>
-        </w:tc>
-        <w:tc>
-          <w:tcPr>
-            <w:tcW w:w="1163" w:type="dxa"/>
-          </w:tcPr>
-          <w:p>
-            <w:pPr>
-              <w:jc w:val="center"/>
-              <w:rPr>
-                <w:lang w:val="en-US"/>
-              </w:rPr>
-            </w:pPr>
-            <w:r>
-              <w:rPr>
-                <w:lang w:val="en-US"/>
-              </w:rPr>
-              <w:t>1</w:t>
-            </w:r>
-          </w:p>
-        </w:tc>
-      </w:tr>
-      <w:tr>
-        <w:trPr>
-          <w:trHeight w:val="340"/>
-        </w:trPr>
-        <w:tc>
-          <w:tcPr>
-            <w:tcW w:w="1004" w:type="dxa"/>
-          </w:tcPr>
-          <w:p>
-            <w:pPr>
-              <w:jc w:val="center"/>
-              <w:rPr>
-                <w:lang w:val="en-US"/>
-              </w:rPr>
-            </w:pPr>
-            <w:r>
-              <w:rPr>
-                <w:lang w:val="en-US"/>
-              </w:rPr>
-              <w:t>0</w:t>
-            </w:r>
-          </w:p>
-        </w:tc>
-        <w:tc>
-          <w:tcPr>
-            <w:tcW w:w="1004" w:type="dxa"/>
-          </w:tcPr>
-          <w:p>
-            <w:pPr>
-              <w:jc w:val="center"/>
-              <w:rPr>
-                <w:lang w:val="en-US"/>
-              </w:rPr>
-            </w:pPr>
-            <w:r>
-              <w:rPr>
-                <w:lang w:val="en-US"/>
-              </w:rPr>
-              <w:t>1</w:t>
-            </w:r>
-          </w:p>
-        </w:tc>
-        <w:tc>
-          <w:tcPr>
-            <w:tcW w:w="1005" w:type="dxa"/>
-          </w:tcPr>
-          <w:p>
-            <w:pPr>
-              <w:jc w:val="center"/>
-              <w:rPr>
-                <w:lang w:val="en-US"/>
-              </w:rPr>
-            </w:pPr>
-            <w:r>
-              <w:rPr>
-                <w:lang w:val="en-US"/>
-              </w:rPr>
-              <w:t>0</w:t>
-            </w:r>
-          </w:p>
-        </w:tc>
-        <w:tc>
-          <w:tcPr>
-            <w:tcW w:w="1163" w:type="dxa"/>
-          </w:tcPr>
-          <w:p>
-            <w:pPr>
-              <w:jc w:val="center"/>
-              <w:rPr>
-                <w:lang w:val="en-US"/>
-              </w:rPr>
-            </w:pPr>
-            <w:r>
-              <w:rPr>
-                <w:lang w:val="en-US"/>
-              </w:rPr>
-              <w:t>1</w:t>
-            </w:r>
-          </w:p>
-        </w:tc>
-        <w:tc>
-          <w:tcPr>
-            <w:tcW w:w="1163" w:type="dxa"/>
-          </w:tcPr>
-          <w:p>
-            <w:pPr>
-              <w:jc w:val="center"/>
-              <w:rPr>
-                <w:lang w:val="en-US"/>
-              </w:rPr>
-            </w:pPr>
-            <w:r>
-              <w:rPr>
-                <w:lang w:val="en-US"/>
-              </w:rPr>
-              <w:t>0</w:t>
-            </w:r>
-          </w:p>
-        </w:tc>
-      </w:tr>
-      <w:tr>
-        <w:trPr>
-          <w:trHeight w:val="340"/>
-        </w:trPr>
-        <w:tc>
-          <w:tcPr>
-            <w:tcW w:w="1004" w:type="dxa"/>
-          </w:tcPr>
-          <w:p>
-            <w:pPr>
-              <w:jc w:val="center"/>
-              <w:rPr>
-                <w:lang w:val="en-US"/>
-              </w:rPr>
-            </w:pPr>
-            <w:r>
-              <w:rPr>
-                <w:lang w:val="en-US"/>
-              </w:rPr>
-              <w:t>0</w:t>
-            </w:r>
-          </w:p>
-        </w:tc>
-        <w:tc>
-          <w:tcPr>
-            <w:tcW w:w="1004" w:type="dxa"/>
-          </w:tcPr>
-          <w:p>
-            <w:pPr>
-              <w:jc w:val="center"/>
-              <w:rPr>
-                <w:lang w:val="en-US"/>
-              </w:rPr>
-            </w:pPr>
-            <w:r>
-              <w:rPr>
-                <w:lang w:val="en-US"/>
-              </w:rPr>
-              <w:t>1</w:t>
-            </w:r>
-          </w:p>
-        </w:tc>
-        <w:tc>
-          <w:tcPr>
-            <w:tcW w:w="1005" w:type="dxa"/>
-          </w:tcPr>
-          <w:p>
-            <w:pPr>
-              <w:jc w:val="center"/>
-              <w:rPr>
-                <w:lang w:val="en-US"/>
-              </w:rPr>
-            </w:pPr>
-            <w:r>
-              <w:rPr>
-                <w:lang w:val="en-US"/>
-              </w:rPr>
-              <w:t>1</w:t>
-            </w:r>
-          </w:p>
-        </w:tc>
-        <w:tc>
-          <w:tcPr>
-            <w:tcW w:w="1163" w:type="dxa"/>
-          </w:tcPr>
-          <w:p>
-            <w:pPr>
-              <w:jc w:val="center"/>
-              <w:rPr>
-                <w:lang w:val="en-US"/>
-              </w:rPr>
-            </w:pPr>
-            <w:r>
-              <w:rPr>
-                <w:lang w:val="en-US"/>
-              </w:rPr>
-              <w:t>0</w:t>
-            </w:r>
-          </w:p>
-        </w:tc>
-        <w:tc>
-          <w:tcPr>
-            <w:tcW w:w="1163" w:type="dxa"/>
-          </w:tcPr>
-          <w:p>
-            <w:pPr>
-              <w:jc w:val="center"/>
-              <w:rPr>
-                <w:lang w:val="en-US"/>
-              </w:rPr>
-            </w:pPr>
-            <w:r>
-              <w:rPr>
-                <w:lang w:val="en-US"/>
-              </w:rPr>
-              <w:t>1</w:t>
-            </w:r>
-          </w:p>
-        </w:tc>
-      </w:tr>
-      <w:tr>
-        <w:trPr>
-          <w:trHeight w:val="340"/>
-        </w:trPr>
-        <w:tc>
-          <w:tcPr>
-            <w:tcW w:w="1004" w:type="dxa"/>
-          </w:tcPr>
-          <w:p>
-            <w:pPr>
-              <w:jc w:val="center"/>
-              <w:rPr>
-                <w:lang w:val="en-US"/>
-              </w:rPr>
-            </w:pPr>
-            <w:r>
-              <w:rPr>
-                <w:lang w:val="en-US"/>
-              </w:rPr>
-              <w:t>1</w:t>
-            </w:r>
-          </w:p>
-        </w:tc>
-        <w:tc>
-          <w:tcPr>
-            <w:tcW w:w="1004" w:type="dxa"/>
-          </w:tcPr>
-          <w:p>
-            <w:pPr>
-              <w:jc w:val="center"/>
-              <w:rPr>
-                <w:lang w:val="en-US"/>
-              </w:rPr>
-            </w:pPr>
-            <w:r>
-              <w:rPr>
-                <w:lang w:val="en-US"/>
-              </w:rPr>
-              <w:t>0</w:t>
-            </w:r>
-          </w:p>
-        </w:tc>
-        <w:tc>
-          <w:tcPr>
-            <w:tcW w:w="1005" w:type="dxa"/>
-          </w:tcPr>
-          <w:p>
-            <w:pPr>
-              <w:jc w:val="center"/>
-              <w:rPr>
-                <w:lang w:val="en-US"/>
-              </w:rPr>
-            </w:pPr>
-            <w:r>
-              <w:rPr>
-                <w:lang w:val="en-US"/>
-              </w:rPr>
-              <w:t>0</w:t>
-            </w:r>
-          </w:p>
-        </w:tc>
-        <w:tc>
-          <w:tcPr>
-            <w:tcW w:w="1163" w:type="dxa"/>
-          </w:tcPr>
-          <w:p>
-            <w:pPr>
-              <w:jc w:val="center"/>
-              <w:rPr>
-                <w:lang w:val="en-US"/>
-              </w:rPr>
-            </w:pPr>
-            <w:r>
-              <w:rPr>
-                <w:lang w:val="en-US"/>
-              </w:rPr>
-              <w:t>1</w:t>
-            </w:r>
-          </w:p>
-        </w:tc>
-        <w:tc>
-          <w:tcPr>
-            <w:tcW w:w="1163" w:type="dxa"/>
-          </w:tcPr>
-          <w:p>
-            <w:pPr>
-              <w:jc w:val="center"/>
-              <w:rPr>
-                <w:lang w:val="en-US"/>
-              </w:rPr>
-            </w:pPr>
-            <w:r>
-              <w:rPr>
-                <w:lang w:val="en-US"/>
-              </w:rPr>
-              <w:t>0</w:t>
-            </w:r>
-          </w:p>
-        </w:tc>
-      </w:tr>
-      <w:tr>
-        <w:trPr>
-          <w:trHeight w:val="340"/>
-        </w:trPr>
-        <w:tc>
-          <w:tcPr>
-            <w:tcW w:w="1004" w:type="dxa"/>
-          </w:tcPr>
-          <w:p>
-            <w:pPr>
-              <w:jc w:val="center"/>
-              <w:rPr>
-                <w:lang w:val="en-US"/>
-              </w:rPr>
-            </w:pPr>
-            <w:r>
-              <w:rPr>
-                <w:lang w:val="en-US"/>
-              </w:rPr>
-              <w:t>1</w:t>
-            </w:r>
-          </w:p>
-        </w:tc>
-        <w:tc>
-          <w:tcPr>
-            <w:tcW w:w="1004" w:type="dxa"/>
-          </w:tcPr>
-          <w:p>
-            <w:pPr>
-              <w:jc w:val="center"/>
-              <w:rPr>
-                <w:lang w:val="en-US"/>
-              </w:rPr>
-            </w:pPr>
-            <w:r>
-              <w:rPr>
-                <w:lang w:val="en-US"/>
-              </w:rPr>
-              <w:t>0</w:t>
-            </w:r>
-          </w:p>
-        </w:tc>
-        <w:tc>
-          <w:tcPr>
-            <w:tcW w:w="1005" w:type="dxa"/>
-          </w:tcPr>
-          <w:p>
-            <w:pPr>
-              <w:jc w:val="center"/>
-              <w:rPr>
-                <w:lang w:val="en-US"/>
-              </w:rPr>
-            </w:pPr>
-            <w:r>
-              <w:rPr>
-                <w:lang w:val="en-US"/>
-              </w:rPr>
-              <w:t>1</w:t>
-            </w:r>
-          </w:p>
-        </w:tc>
-        <w:tc>
-          <w:tcPr>
-            <w:tcW w:w="1163" w:type="dxa"/>
-          </w:tcPr>
-          <w:p>
-            <w:pPr>
-              <w:jc w:val="center"/>
-              <w:rPr>
-                <w:lang w:val="en-US"/>
-              </w:rPr>
-            </w:pPr>
-            <w:r>
-              <w:rPr>
-                <w:lang w:val="en-US"/>
-              </w:rPr>
-              <w:t>0</w:t>
-            </w:r>
-          </w:p>
-        </w:tc>
-        <w:tc>
-          <w:tcPr>
-            <w:tcW w:w="1163" w:type="dxa"/>
-          </w:tcPr>
-          <w:p>
-            <w:pPr>
-              <w:jc w:val="center"/>
-              <w:rPr>
-                <w:lang w:val="en-US"/>
-              </w:rPr>
-            </w:pPr>
-            <w:r>
-              <w:rPr>
-                <w:lang w:val="en-US"/>
-              </w:rPr>
-              <w:t>1</w:t>
-            </w:r>
-          </w:p>
-        </w:tc>
-      </w:tr>
-      <w:tr>
-        <w:trPr>
-          <w:trHeight w:val="340"/>
-        </w:trPr>
-        <w:tc>
-          <w:tcPr>
-            <w:tcW w:w="1004" w:type="dxa"/>
-          </w:tcPr>
-          <w:p>
-            <w:pPr>
-              <w:jc w:val="center"/>
-              <w:rPr>
-                <w:lang w:val="en-US"/>
-              </w:rPr>
-            </w:pPr>
-            <w:r>
-              <w:rPr>
-                <w:lang w:val="en-US"/>
-              </w:rPr>
-              <w:t>1</w:t>
-            </w:r>
-          </w:p>
-        </w:tc>
-        <w:tc>
-          <w:tcPr>
-            <w:tcW w:w="1004" w:type="dxa"/>
-          </w:tcPr>
-          <w:p>
-            <w:pPr>
-              <w:jc w:val="center"/>
-              <w:rPr>
-                <w:lang w:val="en-US"/>
-              </w:rPr>
-            </w:pPr>
-            <w:r>
-              <w:rPr>
-                <w:lang w:val="en-US"/>
-              </w:rPr>
-              <w:t>1</w:t>
-            </w:r>
-          </w:p>
-        </w:tc>
-        <w:tc>
-          <w:tcPr>
-            <w:tcW w:w="1005" w:type="dxa"/>
-          </w:tcPr>
-          <w:p>
-            <w:pPr>
-              <w:jc w:val="center"/>
-              <w:rPr>
-                <w:lang w:val="en-US"/>
-              </w:rPr>
-            </w:pPr>
-            <w:r>
-              <w:rPr>
-                <w:lang w:val="en-US"/>
-              </w:rPr>
-              <w:t>0</w:t>
-            </w:r>
-          </w:p>
-        </w:tc>
-        <w:tc>
-          <w:tcPr>
-            <w:tcW w:w="1163" w:type="dxa"/>
-          </w:tcPr>
-          <w:p>
-            <w:pPr>
-              <w:jc w:val="center"/>
-              <w:rPr>
-                <w:lang w:val="en-US"/>
-              </w:rPr>
-            </w:pPr>
-            <w:r>
-              <w:rPr>
-                <w:lang w:val="en-US"/>
-              </w:rPr>
-              <w:t>0</w:t>
-            </w:r>
-          </w:p>
-        </w:tc>
-        <w:tc>
-          <w:tcPr>
-            <w:tcW w:w="1163" w:type="dxa"/>
-          </w:tcPr>
-          <w:p>
-            <w:pPr>
-              <w:jc w:val="center"/>
-              <w:rPr>
-                <w:lang w:val="en-US"/>
-              </w:rPr>
-            </w:pPr>
-            <w:r>
-              <w:rPr>
-                <w:lang w:val="en-US"/>
-              </w:rPr>
-              <w:t>1</w:t>
-            </w:r>
-          </w:p>
-        </w:tc>
-      </w:tr>
-      <w:tr>
-        <w:trPr>
-          <w:trHeight w:val="340"/>
-        </w:trPr>
-        <w:tc>
-          <w:tcPr>
-            <w:tcW w:w="1004" w:type="dxa"/>
-          </w:tcPr>
-          <w:p>
-            <w:pPr>
-              <w:jc w:val="center"/>
-              <w:rPr>
-                <w:lang w:val="en-US"/>
-              </w:rPr>
-            </w:pPr>
-            <w:r>
-              <w:rPr>
-                <w:lang w:val="en-US"/>
-              </w:rPr>
-              <w:t>1</w:t>
-            </w:r>
-          </w:p>
-        </w:tc>
-        <w:tc>
-          <w:tcPr>
-            <w:tcW w:w="1004" w:type="dxa"/>
-          </w:tcPr>
-          <w:p>
-            <w:pPr>
-              <w:jc w:val="center"/>
-              <w:rPr>
-                <w:lang w:val="en-US"/>
-              </w:rPr>
-            </w:pPr>
-            <w:r>
-              <w:rPr>
-                <w:lang w:val="en-US"/>
-              </w:rPr>
-              <w:t>1</w:t>
-            </w:r>
-          </w:p>
-        </w:tc>
-        <w:tc>
-          <w:tcPr>
-            <w:tcW w:w="1005" w:type="dxa"/>
-          </w:tcPr>
-          <w:p>
-            <w:pPr>
-              <w:jc w:val="center"/>
-              <w:rPr>
-                <w:lang w:val="en-US"/>
-              </w:rPr>
-            </w:pPr>
-            <w:r>
-              <w:rPr>
-                <w:lang w:val="en-US"/>
-              </w:rPr>
-              <w:t>1</w:t>
-            </w:r>
-          </w:p>
-        </w:tc>
-        <w:tc>
-          <w:tcPr>
-            <w:tcW w:w="1163" w:type="dxa"/>
-          </w:tcPr>
-          <w:p>
-            <w:pPr>
-              <w:jc w:val="center"/>
-              <w:rPr>
-                <w:lang w:val="en-US"/>
-              </w:rPr>
-            </w:pPr>
-            <w:r>
-              <w:rPr>
-                <w:lang w:val="en-US"/>
-              </w:rPr>
-              <w:t>1</w:t>
-            </w:r>
-          </w:p>
-        </w:tc>
-        <w:tc>
-          <w:tcPr>
-            <w:tcW w:w="1163" w:type="dxa"/>
-          </w:tcPr>
-          <w:p>
-            <w:pPr>
-              <w:jc w:val="center"/>
-              <w:rPr>
-                <w:lang w:val="en-US"/>
-              </w:rPr>
-            </w:pPr>
-            <w:r>
-              <w:rPr>
-                <w:lang w:val="en-US"/>
-              </w:rPr>
-              <w:t>1</w:t>
-            </w:r>
-          </w:p>
-        </w:tc>
-      </w:tr>
-    </w:tbl>
-    <w:p>
-      <w:pPr>
-        <w:rPr>
-          <w:lang w:val="ro-RO"/>
-        </w:rPr>
-      </w:pPr>
-    </w:p>
-    <w:p>
-      <w:pPr>
-        <w:rPr>
-          <w:lang w:val="en-US"/>
-        </w:rPr>
-      </w:pPr>
+          <w:rFonts w:eastAsiaTheme="majorEastAsia" w:cstheme="majorBidi"/>
+          <w:b/>
+          <w:smallCaps/>
+          <w:sz w:val="28"/>
+          <w:szCs w:val="40"/>
+          <w:lang w:val="en-US"/>
+        </w:rPr>
+      </w:pPr>
+      <w:bookmarkStart w:id="71" w:name="_Toc227575099"/>
       <w:r>
         <w:rPr>
           <w:lang w:val="en-US"/>
@@ -14228,7 +13188,6 @@
           <w:lang w:val="en-US"/>
         </w:rPr>
       </w:pPr>
-      <w:bookmarkStart w:id="71" w:name="_Toc227575099"/>
       <w:r>
         <w:rPr>
           <w:lang w:val="en-US"/>
@@ -14311,7 +13270,7 @@
         </w:rPr>
         <w:t xml:space="preserve">, 16 Nov. 2020, </w:t>
       </w:r>
-      <w:hyperlink r:id="rId129" w:history="1">
+      <w:hyperlink r:id="rId128" w:history="1">
         <w:r>
           <w:rPr>
             <w:rStyle w:val="Hyperlink"/>
@@ -14348,7 +13307,7 @@
         </w:rPr>
         <w:t xml:space="preserve">, 4 Dec. 2020, </w:t>
       </w:r>
-      <w:hyperlink r:id="rId130" w:history="1">
+      <w:hyperlink r:id="rId129" w:history="1">
         <w:r>
           <w:rPr>
             <w:rStyle w:val="Hyperlink"/>
@@ -14393,7 +13352,7 @@
         </w:rPr>
         <w:t xml:space="preserve">, 21 Nov. 2016, </w:t>
       </w:r>
-      <w:hyperlink r:id="rId131" w:history="1">
+      <w:hyperlink r:id="rId130" w:history="1">
         <w:r>
           <w:rPr>
             <w:rStyle w:val="Hyperlink"/>
@@ -14438,7 +13397,7 @@
           <w:lang w:val="en-US"/>
         </w:rPr>
       </w:pPr>
-      <w:hyperlink r:id="rId132" w:history="1">
+      <w:hyperlink r:id="rId131" w:history="1">
         <w:r>
           <w:rPr>
             <w:rStyle w:val="Hyperlink"/>
@@ -14497,7 +13456,7 @@
         </w:rPr>
         <w:t xml:space="preserve">, 28 Sept. 2024, </w:t>
       </w:r>
-      <w:hyperlink r:id="rId133" w:history="1">
+      <w:hyperlink r:id="rId132" w:history="1">
         <w:r>
           <w:rPr>
             <w:rStyle w:val="Hyperlink"/>
@@ -14548,7 +13507,7 @@
         </w:rPr>
         <w:t xml:space="preserve">, 7 Dec. 2024, </w:t>
       </w:r>
-      <w:hyperlink r:id="rId134" w:history="1">
+      <w:hyperlink r:id="rId133" w:history="1">
         <w:r>
           <w:rPr>
             <w:rStyle w:val="Hyperlink"/>
@@ -14601,7 +13560,7 @@
           <w:lang w:val="en-US"/>
         </w:rPr>
       </w:pPr>
-      <w:hyperlink r:id="rId135" w:history="1">
+      <w:hyperlink r:id="rId134" w:history="1">
         <w:r>
           <w:rPr>
             <w:rStyle w:val="Hyperlink"/>
@@ -14646,7 +13605,7 @@
         </w:rPr>
         <w:t xml:space="preserve">, 19 Nov. 2022, </w:t>
       </w:r>
-      <w:hyperlink r:id="rId136" w:history="1">
+      <w:hyperlink r:id="rId135" w:history="1">
         <w:r>
           <w:rPr>
             <w:rStyle w:val="Hyperlink"/>
@@ -14691,7 +13650,7 @@
         </w:rPr>
         <w:t xml:space="preserve">, 17 Feb. 2023, </w:t>
       </w:r>
-      <w:hyperlink r:id="rId137" w:history="1">
+      <w:hyperlink r:id="rId136" w:history="1">
         <w:r>
           <w:rPr>
             <w:rStyle w:val="Hyperlink"/>
@@ -14750,7 +13709,7 @@
         </w:rPr>
         <w:t xml:space="preserve">, 15 Sept. 2019, </w:t>
       </w:r>
-      <w:hyperlink r:id="rId138" w:history="1">
+      <w:hyperlink r:id="rId137" w:history="1">
         <w:r>
           <w:rPr>
             <w:rStyle w:val="Hyperlink"/>
@@ -14805,7 +13764,7 @@
         </w:rPr>
         <w:t xml:space="preserve"> 2020, </w:t>
       </w:r>
-      <w:hyperlink r:id="rId139" w:history="1">
+      <w:hyperlink r:id="rId138" w:history="1">
         <w:r>
           <w:rPr>
             <w:rStyle w:val="Hyperlink"/>
@@ -14842,7 +13801,7 @@
         </w:rPr>
         <w:t xml:space="preserve">, 17 Sept. 2025, </w:t>
       </w:r>
-      <w:hyperlink r:id="rId140" w:history="1">
+      <w:hyperlink r:id="rId139" w:history="1">
         <w:r>
           <w:rPr>
             <w:rStyle w:val="Hyperlink"/>
@@ -14853,7 +13812,7 @@
       </w:hyperlink>
     </w:p>
     <w:sectPr>
-      <w:footerReference w:type="first" r:id="rId141"/>
+      <w:footerReference w:type="first" r:id="rId140"/>
       <w:pgSz w:w="11906" w:h="16838"/>
       <w:pgMar w:top="1440" w:right="1440" w:bottom="1440" w:left="1440" w:header="709" w:footer="708" w:gutter="0"/>
       <w:pgNumType w:start="3"/>

</xml_diff>